<commit_message>
docs: numbered citations in full draft (scripts/build_draft.py)
</commit_message>
<xml_diff>
--- a/docs/thesis-draft.docx
+++ b/docs/thesis-draft.docx
@@ -224,7 +224,7 @@
           <w:b w:val="0"/>
           <w:sz w:val="24"/>
         </w:rPr>
-        <w:t>随着互联网和移动终端的普及，股吧、雪球、微博等金融社交媒体已成为中国个人投资者获取信息、交流观点的重要渠道。投资者在这些平台上发布的大量短文本中蕴含着对个股、行业乃至整体市场的情绪倾向。已有研究表明，媒体和网络论坛中的投资者情绪与资产价格、交易量和市场波动存在显著关联 [Tetlock, 2007; 游家兴和吴静, 2012; 段江娇等, 2017; 部慧等, 2018]。因此，如何从海量金融文本中准确、自动地识别情感倾向，是金融科技和计量金融研究中的一个基础问题 [沈艳等, 2019]。</w:t>
+        <w:t>随着互联网和移动终端的普及，股吧、雪球、微博等金融社交媒体已成为中国个人投资者获取信息、交流观点的重要渠道。投资者在这些平台上发布的大量短文本中蕴含着对个股、行业乃至整体市场的情绪倾向。已有研究表明，媒体和网络论坛中的投资者情绪与资产价格、交易量和市场波动存在显著关联[1-4]。因此，如何从海量金融文本中准确、自动地识别情感倾向，是金融科技和计量金融研究中的一个基础问题[5]。</w:t>
       </w:r>
     </w:p>
     <w:p>
@@ -238,7 +238,7 @@
           <w:b w:val="0"/>
           <w:sz w:val="24"/>
         </w:rPr>
-        <w:t>金融情感分析的方法经历了从情感词典、传统机器学习到预训练语言模型的演进。情感词典方法依赖人工构建的领域词表 [Loughran 和 McDonald, 2011]，可解释性强，但难以处理否定、反讽和上下文相关的表达。以 TF-IDF 特征配合逻辑回归、支持向量机为代表的传统机器学习方法，在有标注数据时效果明显提升，但仍停留在词袋层面。以 BERT [Devlin 等, 2019] 为代表的预训练语言模型通过“预训练 + 微调”范式大幅提升了文本分类效果，在金融领域也出现了 FinBERT [Araci, 2019] 以及面向中文的 RoBERTa-wwm-ext [Cui 等, 2021] 等模型。</w:t>
+        <w:t>金融情感分析的方法经历了从情感词典、传统机器学习到预训练语言模型的演进。情感词典方法依赖人工构建的领域词表[6]，可解释性强，但难以处理否定、反讽和上下文相关的表达。以 TF-IDF 特征配合逻辑回归、支持向量机为代表的传统机器学习方法，在有标注数据时效果明显提升，但仍停留在词袋层面。以 BERT[7] 为代表的预训练语言模型通过“预训练 + 微调”范式大幅提升了文本分类效果，在金融领域也出现了 FinBERT[8] 以及面向中文的 RoBERTa-wwm-ext[9] 等模型。</w:t>
       </w:r>
     </w:p>
     <w:p>
@@ -252,7 +252,7 @@
           <w:b w:val="0"/>
           <w:sz w:val="24"/>
         </w:rPr>
-        <w:t>近年来，以 GPT 系列 [Brown 等, 2020] 和 Qwen3 [Yang 等, 2025] 为代表的大语言模型展现出强大的语言理解与生成能力，金融领域也出现了 BloombergGPT [Wu 等, 2023]、FinGPT [Yang 等, 2023] 等专门模型。但大模型参数量达数十亿，全参数微调的计算成本很高。LoRA [Hu 等, 2022] 和 QLoRA [Dettmers 等, 2023] 等参数高效微调方法只训练少量低秩参数，使 7B～9B 规模的模型可以在单张消费级显卡上完成微调，为普通研究者在特定任务上使用大模型提供了可能。</w:t>
+        <w:t>近年来，以 GPT 系列[10] 和 Qwen3[11] 为代表的大语言模型展现出强大的语言理解与生成能力，金融领域也出现了 BloombergGPT[12]、FinGPT[13] 等专门模型。但大模型参数量达数十亿，全参数微调的计算成本很高。LoRA[14] 和 QLoRA[15] 等参数高效微调方法只训练少量低秩参数，使 7B～9B 规模的模型可以在单张消费级显卡上完成微调，为普通研究者在特定任务上使用大模型提供了可能。</w:t>
       </w:r>
     </w:p>
     <w:p>
@@ -336,7 +336,7 @@
           <w:b w:val="0"/>
           <w:sz w:val="24"/>
         </w:rPr>
-        <w:t xml:space="preserve"> 大模型金融情感分析的研究多基于 Financial PhraseBank [Malo 等, 2014]、FiQA 等英文数据集 [Zhang 等, 2023; Fatemi 和 Hu, 2023; Paredes Amorin 等, 2025]，针对中文金融社交媒体短文本的系统比较较少。</w:t>
+        <w:t xml:space="preserve"> 大模型金融情感分析的研究多基于 Financial PhraseBank[16]、FiQA 等英文数据集[17-19]，针对中文金融社交媒体短文本的系统比较较少。</w:t>
       </w:r>
     </w:p>
     <w:p>
@@ -396,7 +396,7 @@
           <w:b w:val="0"/>
           <w:sz w:val="24"/>
         </w:rPr>
-        <w:t xml:space="preserve"> 实际应用中，模型不仅要给出类别，还要给出可信的置信度，以便把没把握的样本交给人工处理。已有研究指出神经网络和 LoRA 微调的大模型存在过度自信问题 [Guo 等, 2017; Balabanov 和 Linander, 2024]，但在中文金融情感任务上尚缺少系统评估。</w:t>
+        <w:t xml:space="preserve"> 实际应用中，模型不仅要给出类别，还要给出可信的置信度，以便把没把握的样本交给人工处理。已有研究指出神经网络和 LoRA 微调的大模型存在过度自信问题[20,21]，但在中文金融情感任务上尚缺少系统评估。</w:t>
       </w:r>
     </w:p>
     <w:p>
@@ -510,7 +510,7 @@
           <w:b w:val="0"/>
           <w:sz w:val="24"/>
         </w:rPr>
-        <w:t>本文以 BBT-CFLEB 基准中的 FinFE 数据集 [Lu 等, 2023] 为研究对象，围绕以下几个问题展开：</w:t>
+        <w:t>本文以 BBT-CFLEB 基准中的 FinFE 数据集[22] 为研究对象，围绕以下几个问题展开：</w:t>
       </w:r>
     </w:p>
     <w:p>
@@ -989,7 +989,7 @@
           <w:b w:val="0"/>
           <w:sz w:val="24"/>
         </w:rPr>
-        <w:t>文本情感分析（sentiment analysis）是指从文本中识别作者所表达的主观态度，通常分为积极、消极、中性等类别。金融情感分析是其在金融领域的应用，研究对象包括财经新闻、上市公司公告、研究报告和投资者在社交媒体上发布的评论等。已有研究表明，从这些文本中提取的情绪信息与股票收益、成交量和市场波动存在关联 [Tetlock, 2007; 游家兴和吴静, 2012; 部慧等, 2018]，因此金融情感分析是连接文本数据与金融市场研究的重要环节 [沈艳等, 2019]。</w:t>
+        <w:t>文本情感分析（sentiment analysis）是指从文本中识别作者所表达的主观态度，通常分为积极、消极、中性等类别。金融情感分析是其在金融领域的应用，研究对象包括财经新闻、上市公司公告、研究报告和投资者在社交媒体上发布的评论等。已有研究表明，从这些文本中提取的情绪信息与股票收益、成交量和市场波动存在关联[1,2,4]，因此金融情感分析是连接文本数据与金融市场研究的重要环节[5]。</w:t>
       </w:r>
     </w:p>
     <w:p>
@@ -1003,7 +1003,7 @@
           <w:b w:val="0"/>
           <w:sz w:val="24"/>
         </w:rPr>
-        <w:t>与一般领域相比，金融情感分析有以下特点：一是存在大量领域术语，通用情感词在金融语境中可能含义不同，例如“负债”在一般语境中带有消极色彩，在财务报表中却只是中性的会计科目 [Loughran 和 McDonald, 2011]；二是社交媒体评论篇幅短、口语化，常含股票代码、网络用语和反讽；三是中性与弱积极、弱消极之间的边界模糊，即使人工标注也容易产生分歧 [Malo 等, 2014]。</w:t>
+        <w:t>与一般领域相比，金融情感分析有以下特点：一是存在大量领域术语，通用情感词在金融语境中可能含义不同，例如“负债”在一般语境中带有消极色彩，在财务报表中却只是中性的会计科目[6]；二是社交媒体评论篇幅短、口语化，常含股票代码、网络用语和反讽；三是中性与弱积极、弱消极之间的边界模糊，即使人工标注也容易产生分歧[16]。</w:t>
       </w:r>
     </w:p>
     <w:p>
@@ -1249,7 +1249,7 @@
           <w:b w:val="0"/>
           <w:sz w:val="24"/>
         </w:rPr>
-        <w:t>Transformer [Vaswani 等, 2017] 是目前主流语言模型的基础结构，其核心是自注意力（self-attention）机制。对于输入序列，每个位置的向量通过三个线性变换分别得到查询 Q、键 K 和值 V，注意力输出为：</w:t>
+        <w:t>Transformer[23] 是目前主流语言模型的基础结构，其核心是自注意力（self-attention）机制。对于输入序列，每个位置的向量通过三个线性变换分别得到查询 Q、键 K 和值 V，注意力输出为：</w:t>
       </w:r>
     </w:p>
     <w:p>
@@ -1304,7 +1304,7 @@
           <w:b w:val="0"/>
           <w:sz w:val="24"/>
         </w:rPr>
-        <w:t>BERT [Devlin 等, 2019] 由多层 Transformer 编码器组成，采用“预训练 + 微调”的两阶段范式。在预训练阶段，模型在大规模无标注语料上完成掩码语言模型任务，即随机遮住部分字词，让模型根据上下文进行预测，从而学到通用的语言知识。在微调阶段，在输入序列开头的 [CLS] 位置输出上接一个分类层，用少量有标注数据对整个模型进行训练，即可完成情感分类等下游任务。</w:t>
+        <w:t>BERT[7] 由多层 Transformer 编码器组成，采用“预训练 + 微调”的两阶段范式。在预训练阶段，模型在大规模无标注语料上完成掩码语言模型任务，即随机遮住部分字词，让模型根据上下文进行预测，从而学到通用的语言知识。在微调阶段，在输入序列开头的 [CLS] 位置输出上接一个分类层，用少量有标注数据对整个模型进行训练，即可完成情感分类等下游任务。</w:t>
       </w:r>
     </w:p>
     <w:p>
@@ -1318,7 +1318,7 @@
           <w:b w:val="0"/>
           <w:sz w:val="24"/>
         </w:rPr>
-        <w:t>在中文场景中，Cui 等（2021）提出了全词掩码（whole word masking）策略：遮盖时以词为单位，而不是只遮盖单个汉字，使模型更好地学习词级语义。RoBERTa-wwm-ext 在此基础上采用了 RoBERTa 的训练方式，并使用了更大规模的中文语料，是中文文本分类中常用的强基线。在金融领域，FinBERT [Araci, 2019] 等模型通过在金融语料上继续预训练进一步提升了效果。</w:t>
+        <w:t>在中文场景中，Cui 等[9]提出了全词掩码（whole word masking）策略：遮盖时以词为单位，而不是只遮盖单个汉字，使模型更好地学习词级语义。RoBERTa-wwm-ext 在此基础上采用了 RoBERTa 的训练方式，并使用了更大规模的中文语料，是中文文本分类中常用的强基线。在金融领域，FinBERT[8] 等模型通过在金融语料上继续预训练进一步提升了效果。</w:t>
       </w:r>
     </w:p>
     <w:p>
@@ -1358,7 +1358,7 @@
           <w:b w:val="0"/>
           <w:sz w:val="24"/>
         </w:rPr>
-        <w:t>大语言模型（large language model, LLM）通常指参数量在数十亿以上、基于 Transformer 解码器的生成式模型。它们通过“根据前文预测下一个词”的方式在海量文本上进行预训练，研究发现模型性能随参数量、数据量和计算量的增加而按幂律规律提升 [Kaplan 等, 2020]。经过指令微调后，大模型可以按照自然语言指令完成各种任务。本文使用的 Qwen3-8B [Yang 等, 2025]、Qwen2.5-7B-Instruct 和 GLM-4-9B-Chat 都是参数量在 70 亿到 90 亿之间、中文能力较强的开源模型。在金融领域，也出现了 BloombergGPT [Wu 等, 2023]、FinGPT [Yang 等, 2023] 等专门的大模型。</w:t>
+        <w:t>大语言模型（large language model, LLM）通常指参数量在数十亿以上、基于 Transformer 解码器的生成式模型。它们通过“根据前文预测下一个词”的方式在海量文本上进行预训练，研究发现模型性能随参数量、数据量和计算量的增加而按幂律规律提升[24]。经过指令微调后，大模型可以按照自然语言指令完成各种任务。本文使用的 Qwen3-8B[11]、Qwen2.5-7B-Instruct 和 GLM-4-9B-Chat 都是参数量在 70 亿到 90 亿之间、中文能力较强的开源模型。在金融领域，也出现了 BloombergGPT[12]、FinGPT[13] 等专门的大模型。</w:t>
       </w:r>
     </w:p>
     <w:p>
@@ -1385,7 +1385,7 @@
           <w:b w:val="0"/>
           <w:sz w:val="24"/>
         </w:rPr>
-        <w:t>大模型可以不经训练、直接通过提示词（prompt）完成分类任务。零样本（zero-shot）提示只给出任务说明和待分类文本，例如“判断下面这条股民评论的情感倾向，只回答消极、中性或积极”；少样本（few-shot）提示则在任务说明后附上若干带标签的示例，让模型通过上下文学习（in-context learning）模仿示例作答 [Brown 等, 2020]。提示方法不需要训练，但效果依赖提示词的设计，且通常不如有监督微调。</w:t>
+        <w:t>大模型可以不经训练、直接通过提示词（prompt）完成分类任务。零样本（zero-shot）提示只给出任务说明和待分类文本，例如“判断下面这条股民评论的情感倾向，只回答消极、中性或积极”；少样本（few-shot）提示则在任务说明后附上若干带标签的示例，让模型通过上下文学习（in-context learning）模仿示例作答[10]。提示方法不需要训练，但效果依赖提示词的设计，且通常不如有监督微调。</w:t>
       </w:r>
     </w:p>
     <w:p>
@@ -1467,7 +1467,7 @@
           <w:b w:val="0"/>
           <w:sz w:val="24"/>
         </w:rPr>
-        <w:t>全参数微调需要更新模型的全部参数。以 80 亿参数的模型为例，仅参数、梯度和优化器状态就需要上百 GB 显存，远超单张消费级显卡的容量。参数高效微调方法只训练少量新增参数，其中 LoRA（low-rank adaptation）[Hu 等, 2022] 是最常用的一种。</w:t>
+        <w:t>全参数微调需要更新模型的全部参数。以 80 亿参数的模型为例，仅参数、梯度和优化器状态就需要上百 GB 显存，远超单张消费级显卡的容量。参数高效微调方法只训练少量新增参数，其中 LoRA（low-rank adaptation）[14] 是最常用的一种。</w:t>
       </w:r>
     </w:p>
     <w:p>
@@ -1536,7 +1536,7 @@
           <w:b w:val="0"/>
           <w:sz w:val="24"/>
         </w:rPr>
-        <w:t>QLoRA [Dettmers 等, 2023] 在 LoRA 的基础上进一步把冻结的预训练权重量化为 4 比特存储，计算时再临时反量化为 16 位精度，LoRA 参数仍以 16 位精度训练。由于冻结权重占显存的绝大部分，这种做法可以把 8B 模型微调的显存需求降低一半以上，而效果与 16 位 LoRA 基本相当。本文在消融实验中比较了两种方式的效果与显存占用。</w:t>
+        <w:t>QLoRA[15] 在 LoRA 的基础上进一步把冻结的预训练权重量化为 4 比特存储，计算时再临时反量化为 16 位精度，LoRA 参数仍以 16 位精度训练。由于冻结权重占显存的绝大部分，这种做法可以把 8B 模型微调的显存需求降低一半以上，而效果与 16 位 LoRA 基本相当。本文在消融实验中比较了两种方式的效果与显存占用。</w:t>
       </w:r>
     </w:p>
     <w:p>
@@ -1678,7 +1678,7 @@
           <w:b w:val="0"/>
           <w:sz w:val="24"/>
         </w:rPr>
-        <w:t>，即测试集只是所有可能样本中的一个有限样本，换一批测试样本，分数也会不同 [Dietterich, 1998]。本文针对这两种来源分别使用不同的检验方法。</w:t>
+        <w:t>，即测试集只是所有可能样本中的一个有限样本，换一批测试样本，分数也会不同[25]。本文针对这两种来源分别使用不同的检验方法。</w:t>
       </w:r>
     </w:p>
     <w:p>
@@ -1760,7 +1760,7 @@
           <w:b w:val="0"/>
           <w:sz w:val="24"/>
         </w:rPr>
-        <w:t>针对测试样本抽样误差，McNemar 检验 [McNemar, 1947] 用于比较两个模型在同一测试集上的准确率。设 b 为模型甲正确而模型乙错误的样本数，c 为模型甲错误而模型乙正确的样本数，在“两模型准确率相同”的原假设下，b 应服从参数为 (b + c, 0.5) 的二项分布；样本较多时，也可用统计量：</w:t>
+        <w:t>针对测试样本抽样误差，McNemar 检验[26] 用于比较两个模型在同一测试集上的准确率。设 b 为模型甲正确而模型乙错误的样本数，c 为模型甲错误而模型乙正确的样本数，在“两模型准确率相同”的原假设下，b 应服从参数为 (b + c, 0.5) 的二项分布；样本较多时，也可用统计量：</w:t>
       </w:r>
     </w:p>
     <w:p>
@@ -1788,7 +1788,7 @@
           <w:b w:val="0"/>
           <w:sz w:val="24"/>
         </w:rPr>
-        <w:t>近似服从自由度为 1 的卡方分布。该检验只利用两个模型预测不一致的样本，考虑了两模型在同一批样本上的配对关系，是比较分类器的常用方法 [Dietterich, 1998]。</w:t>
+        <w:t>近似服从自由度为 1 的卡方分布。该检验只利用两个模型预测不一致的样本，考虑了两模型在同一批样本上的配对关系，是比较分类器的常用方法[25]。</w:t>
       </w:r>
     </w:p>
     <w:p>
@@ -1815,7 +1815,7 @@
           <w:b w:val="0"/>
           <w:sz w:val="24"/>
         </w:rPr>
-        <w:t>宏平均 F1 不是简单的比例，难以写出其差值的解析分布。Bootstrap 方法 [Efron 和 Tibshirani, 1993] 通过重抽样来近似统计量的抽样分布：从 n 个测试样本中有放回地抽取 n 个，组成一个新的测试集，在其上计算两个模型的 F1 差值；重复 B 次（本文取 B = 2000），取所有差值的 2.5% 和 97.5% 分位数作为 95% 置信区间。“配对”指两个模型每次都在同一批重抽样样本上计算，从而保留了两者之间的相关性。若置信区间不包含 0，则认为差异显著。</w:t>
+        <w:t>宏平均 F1 不是简单的比例，难以写出其差值的解析分布。Bootstrap 方法[27] 通过重抽样来近似统计量的抽样分布：从 n 个测试样本中有放回地抽取 n 个，组成一个新的测试集，在其上计算两个模型的 F1 差值；重复 B 次（本文取 B = 2000），取所有差值的 2.5% 和 97.5% 分位数作为 95% 置信区间。“配对”指两个模型每次都在同一批重抽样样本上计算，从而保留了两者之间的相关性。若置信区间不包含 0，则认为差异显著。</w:t>
       </w:r>
     </w:p>
     <w:p>
@@ -1842,7 +1842,7 @@
           <w:b w:val="0"/>
           <w:sz w:val="24"/>
         </w:rPr>
-        <w:t>同时进行 m 次检验时，即使每次检验的显著性水平都是 0.05，至少出现一次误判的概率也会明显增大。Holm 方法 [Holm, 1979] 将 m 个 p 值从小到大排序为 p₍₁₎ ≤ … ≤ p₍ₘ₎，依次将 p₍ᵢ₎ 与 α/(m − i + 1) 比较，一旦某个 p 值不满足条件，就停止并接受其后所有原假设。等价地，校正后的 p 值为：</w:t>
+        <w:t>同时进行 m 次检验时，即使每次检验的显著性水平都是 0.05，至少出现一次误判的概率也会明显增大。Holm 方法[28] 将 m 个 p 值从小到大排序为 p₍₁₎ ≤ … ≤ p₍ₘ₎，依次将 p₍ᵢ₎ 与 α/(m − i + 1) 比较，一旦某个 p 值不满足条件，就停止并接受其后所有原假设。等价地，校正后的 p 值为：</w:t>
       </w:r>
     </w:p>
     <w:p>
@@ -1910,7 +1910,7 @@
           <w:b w:val="0"/>
           <w:sz w:val="24"/>
         </w:rPr>
-        <w:t>如果一个模型对一批样本给出的置信度都是 80%，那么这批样本中应当恰好约 80% 被预测正确，这样的模型称为“校准良好”的模型。研究发现，现代深度神经网络往往过度自信，即置信度系统性地高于实际准确率 [Guo 等, 2017]；LoRA 微调的大模型也存在类似问题 [Balabanov 和 Linander, 2024]。</w:t>
+        <w:t>如果一个模型对一批样本给出的置信度都是 80%，那么这批样本中应当恰好约 80% 被预测正确，这样的模型称为“校准良好”的模型。研究发现，现代深度神经网络往往过度自信，即置信度系统性地高于实际准确率[20]；LoRA 微调的大模型也存在类似问题[21]。</w:t>
       </w:r>
     </w:p>
     <w:p>
@@ -1979,7 +1979,7 @@
           <w:b w:val="0"/>
           <w:sz w:val="24"/>
         </w:rPr>
-        <w:t>温度缩放（temperature scaling）[Guo 等, 2017] 是一种简单有效的校准方法：用一个标量 T &gt; 0 除以模型输出的 logit，再做 softmax：</w:t>
+        <w:t>温度缩放（temperature scaling）[20] 是一种简单有效的校准方法：用一个标量 T &gt; 0 除以模型输出的 logit，再做 softmax：</w:t>
       </w:r>
     </w:p>
     <w:p>
@@ -2034,7 +2034,7 @@
           <w:b w:val="0"/>
           <w:sz w:val="24"/>
         </w:rPr>
-        <w:t>在实际应用中，模型可以对没把握的样本“拒绝回答”，交给人工处理，这称为选择性预测（selective prediction）[Chow, 1970; Geifman 和 El-Yaniv, 2017]。具体做法是设定置信度阈值 τ，只对置信度不低于 τ 的样本给出预测。被模型回答的样本占全部样本的比例称为</w:t>
+        <w:t>在实际应用中，模型可以对没把握的样本“拒绝回答”，交给人工处理，这称为选择性预测（selective prediction）[29,30]。具体做法是设定置信度阈值 τ，只对置信度不低于 τ 的样本给出预测。被模型回答的样本占全部样本的比例称为</w:t>
       </w:r>
       <w:r>
         <w:rPr>
@@ -2245,7 +2245,7 @@
           <w:b w:val="0"/>
           <w:sz w:val="24"/>
         </w:rPr>
-        <w:t>本文使用的数据集为 FinFE（Financial Forum Emotion），它是中文金融评测基准 BBT-CFLEB 中的情感分类子任务 [Lu 等, 2023]。FinFE 的文本来自金融社交媒体上的股民评论，每条评论被标注为消极、中性、积极三类情感之一。与新闻标题、研报等规范文本相比，股民评论篇幅短、口语化程度高，常夹杂股票代码、网络用语和反讽表达，对模型的语义理解能力要求较高。</w:t>
+        <w:t>本文使用的数据集为 FinFE（Financial Forum Emotion），它是中文金融评测基准 BBT-CFLEB 中的情感分类子任务[22]。FinFE 的文本来自金融社交媒体上的股民评论，每条评论被标注为消极、中性、积极三类情感之一。与新闻标题、研报等规范文本相比，股民评论篇幅短、口语化程度高，常夹杂股票代码、网络用语和反讽表达，对模型的语义理解能力要求较高。</w:t>
       </w:r>
     </w:p>
     <w:p>
@@ -4732,7 +4732,7 @@
                 <w:b w:val="0"/>
                 <w:sz w:val="21"/>
               </w:rPr>
-              <w:t>BERT-base-Chinese [Devlin 等, 2019]</w:t>
+              <w:t>BERT-base-Chinese[7]</w:t>
             </w:r>
           </w:p>
         </w:tc>
@@ -4798,7 +4798,7 @@
                 <w:b w:val="0"/>
                 <w:sz w:val="21"/>
               </w:rPr>
-              <w:t>Chinese-RoBERTa-wwm-ext [Cui 等, 2021]</w:t>
+              <w:t>Chinese-RoBERTa-wwm-ext[9]</w:t>
             </w:r>
           </w:p>
         </w:tc>
@@ -5089,7 +5089,7 @@
           <w:b w:val="0"/>
           <w:sz w:val="24"/>
         </w:rPr>
-        <w:t>LoRA（Low-Rank Adaptation）[Hu 等, 2022] 冻结预训练模型的全部原始权重，只在指定的权重矩阵 W 旁并联一个低秩分解 ΔW = BA，其中 B 为 d × r 矩阵，A 为 r × k 矩阵，秩 r 远小于 d 和 k。前向计算变为：</w:t>
+        <w:t>LoRA（Low-Rank Adaptation）[14] 冻结预训练模型的全部原始权重，只在指定的权重矩阵 W 旁并联一个低秩分解 ΔW = BA，其中 B 为 d × r 矩阵，A 为 r × k 矩阵，秩 r 远小于 d 和 k。前向计算变为：</w:t>
       </w:r>
     </w:p>
     <w:p>
@@ -5144,7 +5144,7 @@
           <w:b w:val="0"/>
           <w:sz w:val="24"/>
         </w:rPr>
-        <w:t>为考察量化对效果的影响，本文还实现了 QLoRA [Dettmers 等, 2023]：以 4-bit NF4 格式加载冻结的基础模型权重（采用双重量化），LoRA 模块和计算过程仍使用 bf16 精度。</w:t>
+        <w:t>为考察量化对效果的影响，本文还实现了 QLoRA[15]：以 4-bit NF4 格式加载冻结的基础模型权重（采用双重量化），LoRA 模块和计算过程仍使用 bf16 精度。</w:t>
       </w:r>
     </w:p>
     <w:p>
@@ -5314,7 +5314,7 @@
           <w:b w:val="0"/>
           <w:sz w:val="24"/>
         </w:rPr>
-        <w:t>它近似服从自由度为 1 的卡方分布；当 n₀₁ + n₁₀ &lt; 25 时改用精确二项检验 [McNemar, 1947]。</w:t>
+        <w:t>它近似服从自由度为 1 的卡方分布；当 n₀₁ + n₁₀ &lt; 25 时改用精确二项检验[26]。</w:t>
       </w:r>
     </w:p>
     <w:p>
@@ -5336,7 +5336,7 @@
           <w:b w:val="0"/>
           <w:sz w:val="24"/>
         </w:rPr>
-        <w:t xml:space="preserve"> 对 m 个模型两两比较时共进行 m(m−1)/2 次检验，若不校正，犯第一类错误的总概率会随检验次数上升。Holm 方法 [Holm, 1979] 将 p 值从小到大排序为 p₍₁₎ ≤ … ≤ p₍ₖ₎，依次与 α/k、α/(k−1)、…、α 比较，第一次不拒绝即停止。它控制了族错误率，同时比 Bonferroni 校正更有检验功效。</w:t>
+        <w:t xml:space="preserve"> 对 m 个模型两两比较时共进行 m(m−1)/2 次检验，若不校正，犯第一类错误的总概率会随检验次数上升。Holm 方法[28] 将 p 值从小到大排序为 p₍₁₎ ≤ … ≤ p₍ₖ₎，依次与 α/k、α/(k−1)、…、α 比较，第一次不拒绝即停止。它控制了族错误率，同时比 Bonferroni 校正更有检验功效。</w:t>
       </w:r>
     </w:p>
     <w:p>
@@ -5358,7 +5358,7 @@
           <w:b w:val="0"/>
           <w:sz w:val="24"/>
         </w:rPr>
-        <w:t xml:space="preserve"> McNemar 检验针对的是准确率，而本文的主要指标是 Macro-F1，后者不是逐样本可加的统计量。为此，本文对测试集做有放回重抽样（B = 2000 次），每次在同一组抽样样本上计算两个模型的 Macro-F1 差值，以差值分布的 2.5% 和 97.5% 分位数构成 95% 置信区间 [Efron 和 Tibshirani, 1993]。若区间不包含 0，则认为两模型在 Macro-F1 上存在显著差异。</w:t>
+        <w:t xml:space="preserve"> McNemar 检验针对的是准确率，而本文的主要指标是 Macro-F1，后者不是逐样本可加的统计量。为此，本文对测试集做有放回重抽样（B = 2000 次），每次在同一组抽样样本上计算两个模型的 Macro-F1 差值，以差值分布的 2.5% 和 97.5% 分位数构成 95% 置信区间[27]。若区间不包含 0，则认为两模型在 Macro-F1 上存在显著差异。</w:t>
       </w:r>
     </w:p>
     <w:p>
@@ -5448,7 +5448,7 @@
           <w:b w:val="0"/>
           <w:sz w:val="24"/>
         </w:rPr>
-        <w:t>其中 acc(B_m) 和 conf(B_m) 分别为区间内样本的准确率和平均置信度 [Guo 等, 2017]。此外报告最大校准误差 MCE（各区间差距的最大值）、Brier 分数（预测概率向量与真实标签独热向量的平方误差）和负对数似然 NLL，并绘制可靠性图。</w:t>
+        <w:t>其中 acc(B_m) 和 conf(B_m) 分别为区间内样本的准确率和平均置信度[20]。此外报告最大校准误差 MCE（各区间差距的最大值）、Brier 分数（预测概率向量与真实标签独热向量的平方误差）和负对数似然 NLL，并绘制可靠性图。</w:t>
       </w:r>
     </w:p>
     <w:p>
@@ -5462,7 +5462,7 @@
           <w:b w:val="0"/>
           <w:sz w:val="24"/>
         </w:rPr>
-        <w:t>温度缩放 [Guo 等, 2017] 是一种事后校准方法：将 logit 除以一个标量温度 T 后再做 softmax，T &gt; 1 时概率分布变得更平缓，可以缓解过度自信。T 通过最小化 NLL 估计。由于大模型实验只保存了测试集的预测概率，本文在测试集上采用 5 折交叉拟合：在 4 折上估计 T，应用于剩下的 1 折，保证每个样本的校准概率都来自未见过它的温度估计。</w:t>
+        <w:t>温度缩放[20] 是一种事后校准方法：将 logit 除以一个标量温度 T 后再做 softmax，T &gt; 1 时概率分布变得更平缓，可以缓解过度自信。T 通过最小化 NLL 估计。由于大模型实验只保存了测试集的预测概率，本文在测试集上采用 5 折交叉拟合：在 4 折上估计 T，应用于剩下的 1 折，保证每个样本的校准概率都来自未见过它的温度估计。</w:t>
       </w:r>
     </w:p>
     <w:p>
@@ -5489,7 +5489,7 @@
           <w:b w:val="0"/>
           <w:sz w:val="24"/>
         </w:rPr>
-        <w:t>在实际应用中，模型可以只对有把握的样本给出判断，对没把握的样本交由人工处理。将测试样本按置信度从高到低排序，只保留前 c 比例的样本作答（c 称为覆盖率），计算这部分样本的错误率（风险），得到风险-覆盖率曲线。曲线下面积 AURC 越小，说明模型的置信度越能区分对错 [Geifman 和 El-Yaniv, 2017]。由于 AURC 也受模型整体错误率影响，本文同时报告 E-AURC，即 AURC 减去在同样错误率下按理想排序可达到的最小 AURC，它只衡量置信度排序的质量。</w:t>
+        <w:t>在实际应用中，模型可以只对有把握的样本给出判断，对没把握的样本交由人工处理。将测试样本按置信度从高到低排序，只保留前 c 比例的样本作答（c 称为覆盖率），计算这部分样本的错误率（风险），得到风险-覆盖率曲线。曲线下面积 AURC 越小，说明模型的置信度越能区分对错[30]。由于 AURC 也受模型整体错误率影响，本文同时报告 E-AURC，即 AURC 减去在同样错误率下按理想排序可达到的最小 AURC，它只衡量置信度排序的质量。</w:t>
       </w:r>
     </w:p>
     <w:p>
@@ -7509,7 +7509,7 @@
           <w:b w:val="0"/>
           <w:sz w:val="24"/>
         </w:rPr>
-        <w:t>第二，不经微调的大模型表现较差。三个模型零样本的 Macro-F1 只有 0.644～0.666，甚至低于最简单的 TF-IDF + 逻辑回归（0.702）。这与 DISC-FinLLM [Chen 等, 2023] 等研究报告的通用大模型在 FinFE 上准确率约为 60%～69% 的结论一致，说明通用大模型虽然具备一般的语言理解能力，但并不熟悉股民评论的表达习惯和标注标准。</w:t>
+        <w:t>第二，不经微调的大模型表现较差。三个模型零样本的 Macro-F1 只有 0.644～0.666，甚至低于最简单的 TF-IDF + 逻辑回归（0.702）。这与 DISC-FinLLM[31] 等研究报告的通用大模型在 FinFE 上准确率约为 60%～69% 的结论一致，说明通用大模型虽然具备一般的语言理解能力，但并不熟悉股民评论的表达习惯和标注标准。</w:t>
       </w:r>
     </w:p>
     <w:p>
@@ -15270,6 +15270,20 @@
     </w:p>
     <w:p>
       <w:pPr>
+        <w:spacing w:after="360"/>
+        <w:jc w:val="center"/>
+      </w:pPr>
+      <w:r>
+        <w:rPr>
+          <w:rFonts w:ascii="Times New Roman" w:hAnsi="Times New Roman" w:eastAsia="黑体"/>
+          <w:b/>
+          <w:sz w:val="36"/>
+        </w:rPr>
+        <w:t>第5章 结论与展望</w:t>
+      </w:r>
+    </w:p>
+    <w:p>
+      <w:pPr>
         <w:spacing w:before="240" w:after="120"/>
       </w:pPr>
       <w:r>
@@ -15278,7 +15292,551 @@
           <w:b/>
           <w:sz w:val="28"/>
         </w:rPr>
-        <w:t>参考文献（本章引用）</w:t>
+        <w:t>5.1 主要结论</w:t>
+      </w:r>
+    </w:p>
+    <w:p>
+      <w:pPr>
+        <w:spacing w:line="360" w:lineRule="auto" w:after="0"/>
+        <w:ind w:firstLine="480"/>
+      </w:pPr>
+      <w:r>
+        <w:rPr>
+          <w:rFonts w:ascii="Times New Roman" w:hAnsi="Times New Roman" w:eastAsia="宋体"/>
+          <w:b w:val="0"/>
+          <w:sz w:val="24"/>
+        </w:rPr>
+        <w:t>本文以中文金融社交媒体情感分类数据集 FinFE 为对象，在单张 RTX 3090 显卡上系统比较了传统机器学习、预训练语言模型和开源大语言模型三类方法，并从统计推断、置信度可靠性和数据质量三个角度对结果进行了分析。主要结论如下。</w:t>
+      </w:r>
+    </w:p>
+    <w:p>
+      <w:pPr>
+        <w:spacing w:line="360" w:lineRule="auto" w:after="0"/>
+        <w:ind w:firstLine="480"/>
+      </w:pPr>
+      <w:r>
+        <w:rPr>
+          <w:rFonts w:ascii="Times New Roman" w:hAnsi="Times New Roman" w:eastAsia="宋体"/>
+          <w:b/>
+          <w:sz w:val="24"/>
+        </w:rPr>
+        <w:t>（1）公开基准存在明显的数据质量问题，必须先清洗再评估。</w:t>
+      </w:r>
+      <w:r>
+        <w:rPr>
+          <w:rFonts w:ascii="Times New Roman" w:hAnsi="Times New Roman" w:eastAsia="宋体"/>
+          <w:b w:val="0"/>
+          <w:sz w:val="24"/>
+        </w:rPr>
+        <w:t xml:space="preserve"> FinFE 公开评估集中有 1092 条文本原样出现在训练文件中，其中 228 条标签不一致。如果直接使用公开文件，模型对见过的原句准确率可达 93%～97%，TF-IDF 基线的宏平均 F1 虚高 8.1 个百分点，TF-IDF 与 RoBERTa 的真实差距被缩小约三分之二。经去重和重新划分后，本文得到无泄漏的训练集、验证集和测试集（8802 / 979 / 1713 条）。</w:t>
+      </w:r>
+    </w:p>
+    <w:p>
+      <w:pPr>
+        <w:spacing w:line="360" w:lineRule="auto" w:after="0"/>
+        <w:ind w:firstLine="480"/>
+      </w:pPr>
+      <w:r>
+        <w:rPr>
+          <w:rFonts w:ascii="Times New Roman" w:hAnsi="Times New Roman" w:eastAsia="宋体"/>
+          <w:b/>
+          <w:sz w:val="24"/>
+        </w:rPr>
+        <w:t>（2）LoRA 微调的大模型取得了最好的分类效果，但领先幅度较小。</w:t>
+      </w:r>
+      <w:r>
+        <w:rPr>
+          <w:rFonts w:ascii="Times New Roman" w:hAnsi="Times New Roman" w:eastAsia="宋体"/>
+          <w:b w:val="0"/>
+          <w:sz w:val="24"/>
+        </w:rPr>
+        <w:t xml:space="preserve"> 在清洗后的测试集上，TF-IDF 基线的宏平均 F1 约为 0.70，RoBERTa-wwm-ext 约为 0.778，三个 LoRA 微调大模型为 0.798～0.807。零样本和少样本提示的大模型 F1 只有 0.63～0.70，不如微调后的 RoBERTa，说明在该任务上有监督微调仍然必要。三个大模型之间的差异不显著（方差分析 p = 0.14）。</w:t>
+      </w:r>
+    </w:p>
+    <w:p>
+      <w:pPr>
+        <w:spacing w:line="360" w:lineRule="auto" w:after="0"/>
+        <w:ind w:firstLine="480"/>
+      </w:pPr>
+      <w:r>
+        <w:rPr>
+          <w:rFonts w:ascii="Times New Roman" w:hAnsi="Times New Roman" w:eastAsia="宋体"/>
+          <w:b/>
+          <w:sz w:val="24"/>
+        </w:rPr>
+        <w:t>（3）统计显著性的结论取决于所考虑的不确定性来源。</w:t>
+      </w:r>
+      <w:r>
+        <w:rPr>
+          <w:rFonts w:ascii="Times New Roman" w:hAnsi="Times New Roman" w:eastAsia="宋体"/>
+          <w:b w:val="0"/>
+          <w:sz w:val="24"/>
+        </w:rPr>
+        <w:t xml:space="preserve"> 以 3 个随机种子反映训练随机性时，三个 LoRA 大模型都显著优于 RoBERTa（Tukey 检验 p = 0.0014～0.021）；以测试样本抽样误差为依据时，McNemar 检验经 Holm 校正后不显著（p = 0.55～0.69），配对 Bootstrap 的 F1 差值约为 0.018～0.019，95% 置信区间下限接近或略低于 0。因此，LoRA 大模型的优势是稳定的，但幅度只有约 2 个百分点，在 1713 条的测试集上难以被严格证实。</w:t>
+      </w:r>
+    </w:p>
+    <w:p>
+      <w:pPr>
+        <w:spacing w:line="360" w:lineRule="auto" w:after="0"/>
+        <w:ind w:firstLine="480"/>
+      </w:pPr>
+      <w:r>
+        <w:rPr>
+          <w:rFonts w:ascii="Times New Roman" w:hAnsi="Times New Roman" w:eastAsia="宋体"/>
+          <w:b/>
+          <w:sz w:val="24"/>
+        </w:rPr>
+        <w:t>（4）零样本大模型严重过度自信，微调和温度缩放可以有效改善。</w:t>
+      </w:r>
+      <w:r>
+        <w:rPr>
+          <w:rFonts w:ascii="Times New Roman" w:hAnsi="Times New Roman" w:eastAsia="宋体"/>
+          <w:b w:val="0"/>
+          <w:sz w:val="24"/>
+        </w:rPr>
+        <w:t xml:space="preserve"> 零样本 Qwen3-8B 的平均置信度为 96.4%，而准确率只有 67.1%，ECE 为 0.294；LoRA 微调后 ECE 降至 0.035～0.085，再经温度缩放可降至 0.013～0.030。选择性预测结果表明，LoRA 大模型只处理置信度最高的 50% 样本时准确率约为 96%，处理 80% 样本时约为 89%，AURC 优于 RoBERTa，适合“模型处理高置信度样本、人工复核低置信度样本”的应用方式。</w:t>
+      </w:r>
+    </w:p>
+    <w:p>
+      <w:pPr>
+        <w:spacing w:line="360" w:lineRule="auto" w:after="0"/>
+        <w:ind w:firstLine="480"/>
+      </w:pPr>
+      <w:r>
+        <w:rPr>
+          <w:rFonts w:ascii="Times New Roman" w:hAnsi="Times New Roman" w:eastAsia="宋体"/>
+          <w:b/>
+          <w:sz w:val="24"/>
+        </w:rPr>
+        <w:t>（5）LoRA 微调对超参数不敏感，资源需求较低。</w:t>
+      </w:r>
+      <w:r>
+        <w:rPr>
+          <w:rFonts w:ascii="Times New Roman" w:hAnsi="Times New Roman" w:eastAsia="宋体"/>
+          <w:b w:val="0"/>
+          <w:sz w:val="24"/>
+        </w:rPr>
+        <w:t xml:space="preserve"> 训练样本量从 500 条增加到全量，F1 从 0.766 提升到 0.800，边际收益逐渐递减；LoRA 秩在 4～32 之间变化时 F1 稳定在 0.798～0.809；4 比特 QLoRA 的 F1 为 0.807，与 16 位精度相当，峰值显存仅 11.2 GB。</w:t>
+      </w:r>
+    </w:p>
+    <w:p>
+      <w:pPr>
+        <w:spacing w:line="360" w:lineRule="auto" w:after="0"/>
+        <w:ind w:firstLine="480"/>
+      </w:pPr>
+      <w:r>
+        <w:rPr>
+          <w:rFonts w:ascii="Times New Roman" w:hAnsi="Times New Roman" w:eastAsia="宋体"/>
+          <w:b/>
+          <w:sz w:val="24"/>
+        </w:rPr>
+        <w:t>（6）标注噪声限制了可达到的准确率，中性类是主要难点。</w:t>
+      </w:r>
+      <w:r>
+        <w:rPr>
+          <w:rFonts w:ascii="Times New Roman" w:hAnsi="Times New Roman" w:eastAsia="宋体"/>
+          <w:b w:val="0"/>
+          <w:sz w:val="24"/>
+        </w:rPr>
+        <w:t xml:space="preserve"> 利用重复标注样本估计，标注一致率为 82.9%（κ = 0.735），标注准确率约为 91%，可视为模型准确率的近似上限。所有模型的中性类 F1 都只有 0.69 左右，而 82% 的标注冲突涉及中性类，说明中性类识别困难在很大程度上来自标注本身的模糊性，而不仅是模型能力不足。</w:t>
+      </w:r>
+    </w:p>
+    <w:p>
+      <w:pPr>
+        <w:spacing w:before="240" w:after="120"/>
+      </w:pPr>
+      <w:r>
+        <w:rPr>
+          <w:rFonts w:ascii="Times New Roman" w:hAnsi="Times New Roman" w:eastAsia="黑体"/>
+          <w:b/>
+          <w:sz w:val="28"/>
+        </w:rPr>
+        <w:t>5.2 研究不足</w:t>
+      </w:r>
+    </w:p>
+    <w:p>
+      <w:pPr>
+        <w:spacing w:line="360" w:lineRule="auto" w:after="0"/>
+        <w:ind w:firstLine="480"/>
+      </w:pPr>
+      <w:r>
+        <w:rPr>
+          <w:rFonts w:ascii="Times New Roman" w:hAnsi="Times New Roman" w:eastAsia="宋体"/>
+          <w:b w:val="0"/>
+          <w:sz w:val="24"/>
+        </w:rPr>
+        <w:t>本文仍存在以下不足：</w:t>
+      </w:r>
+    </w:p>
+    <w:p>
+      <w:pPr>
+        <w:spacing w:line="360" w:lineRule="auto" w:after="0"/>
+        <w:ind w:firstLine="480"/>
+      </w:pPr>
+      <w:r>
+        <w:rPr>
+          <w:rFonts w:ascii="Times New Roman" w:hAnsi="Times New Roman" w:eastAsia="宋体"/>
+          <w:b w:val="0"/>
+          <w:sz w:val="24"/>
+        </w:rPr>
+        <w:t>（1）</w:t>
+      </w:r>
+      <w:r>
+        <w:rPr>
+          <w:rFonts w:ascii="Times New Roman" w:hAnsi="Times New Roman" w:eastAsia="宋体"/>
+          <w:b/>
+          <w:sz w:val="24"/>
+        </w:rPr>
+        <w:t>只使用了一个数据集。</w:t>
+      </w:r>
+      <w:r>
+        <w:rPr>
+          <w:rFonts w:ascii="Times New Roman" w:hAnsi="Times New Roman" w:eastAsia="宋体"/>
+          <w:b w:val="0"/>
+          <w:sz w:val="24"/>
+        </w:rPr>
+        <w:t xml:space="preserve"> 本文的结论基于 FinFE 这一中文金融社交媒体数据集，是否适用于金融新闻、研究报告、上市公司公告等其他类型的文本，还需要进一步验证。</w:t>
+      </w:r>
+    </w:p>
+    <w:p>
+      <w:pPr>
+        <w:spacing w:line="360" w:lineRule="auto" w:after="0"/>
+        <w:ind w:firstLine="480"/>
+      </w:pPr>
+      <w:r>
+        <w:rPr>
+          <w:rFonts w:ascii="Times New Roman" w:hAnsi="Times New Roman" w:eastAsia="宋体"/>
+          <w:b w:val="0"/>
+          <w:sz w:val="24"/>
+        </w:rPr>
+        <w:t>（2）</w:t>
+      </w:r>
+      <w:r>
+        <w:rPr>
+          <w:rFonts w:ascii="Times New Roman" w:hAnsi="Times New Roman" w:eastAsia="宋体"/>
+          <w:b/>
+          <w:sz w:val="24"/>
+        </w:rPr>
+        <w:t>随机种子数量较少。</w:t>
+      </w:r>
+      <w:r>
+        <w:rPr>
+          <w:rFonts w:ascii="Times New Roman" w:hAnsi="Times New Roman" w:eastAsia="宋体"/>
+          <w:b w:val="0"/>
+          <w:sz w:val="24"/>
+        </w:rPr>
+        <w:t xml:space="preserve"> 受计算资源限制，每个模型只进行了 3 次独立训练，方差分析的自由度较小，对训练随机性的估计不够精确。</w:t>
+      </w:r>
+    </w:p>
+    <w:p>
+      <w:pPr>
+        <w:spacing w:line="360" w:lineRule="auto" w:after="0"/>
+        <w:ind w:firstLine="480"/>
+      </w:pPr>
+      <w:r>
+        <w:rPr>
+          <w:rFonts w:ascii="Times New Roman" w:hAnsi="Times New Roman" w:eastAsia="宋体"/>
+          <w:b w:val="0"/>
+          <w:sz w:val="24"/>
+        </w:rPr>
+        <w:t>（3）</w:t>
+      </w:r>
+      <w:r>
+        <w:rPr>
+          <w:rFonts w:ascii="Times New Roman" w:hAnsi="Times New Roman" w:eastAsia="宋体"/>
+          <w:b/>
+          <w:sz w:val="24"/>
+        </w:rPr>
+        <w:t>研究计划有所调整。</w:t>
+      </w:r>
+      <w:r>
+        <w:rPr>
+          <w:rFonts w:ascii="Times New Roman" w:hAnsi="Times New Roman" w:eastAsia="宋体"/>
+          <w:b w:val="0"/>
+          <w:sz w:val="24"/>
+        </w:rPr>
+        <w:t xml:space="preserve"> 开题时计划比较同一系列不同规模的模型（Qwen3-1.7B、4B、8B），并在 7 个样本量上各重复 3 次绘制学习曲线。实际实验中，模型比较改为三个不同系列、规模相近（7B～9B）的模型，样本量实验也只在少数几个规模上各进行了一次，因此未能系统分析模型规模的影响，学习曲线也较为粗略。</w:t>
+      </w:r>
+    </w:p>
+    <w:p>
+      <w:pPr>
+        <w:spacing w:line="360" w:lineRule="auto" w:after="0"/>
+        <w:ind w:firstLine="480"/>
+      </w:pPr>
+      <w:r>
+        <w:rPr>
+          <w:rFonts w:ascii="Times New Roman" w:hAnsi="Times New Roman" w:eastAsia="宋体"/>
+          <w:b w:val="0"/>
+          <w:sz w:val="24"/>
+        </w:rPr>
+        <w:t>（4）</w:t>
+      </w:r>
+      <w:r>
+        <w:rPr>
+          <w:rFonts w:ascii="Times New Roman" w:hAnsi="Times New Roman" w:eastAsia="宋体"/>
+          <w:b/>
+          <w:sz w:val="24"/>
+        </w:rPr>
+        <w:t>标注噪声的估计较为粗略。</w:t>
+      </w:r>
+      <w:r>
+        <w:rPr>
+          <w:rFonts w:ascii="Times New Roman" w:hAnsi="Times New Roman" w:eastAsia="宋体"/>
+          <w:b w:val="0"/>
+          <w:sz w:val="24"/>
+        </w:rPr>
+        <w:t xml:space="preserve"> 91% 的上限基于“各类别错误概率相同”的简化噪声模型，且被重复标注的文本平均更短，并非随机样本，因此只能作为近似参考。</w:t>
+      </w:r>
+    </w:p>
+    <w:p>
+      <w:pPr>
+        <w:spacing w:line="360" w:lineRule="auto" w:after="0"/>
+        <w:ind w:firstLine="480"/>
+      </w:pPr>
+      <w:r>
+        <w:rPr>
+          <w:rFonts w:ascii="Times New Roman" w:hAnsi="Times New Roman" w:eastAsia="宋体"/>
+          <w:b w:val="0"/>
+          <w:sz w:val="24"/>
+        </w:rPr>
+        <w:t>（5）</w:t>
+      </w:r>
+      <w:r>
+        <w:rPr>
+          <w:rFonts w:ascii="Times New Roman" w:hAnsi="Times New Roman" w:eastAsia="宋体"/>
+          <w:b/>
+          <w:sz w:val="24"/>
+        </w:rPr>
+        <w:t>测试集中存在近似重复。</w:t>
+      </w:r>
+      <w:r>
+        <w:rPr>
+          <w:rFonts w:ascii="Times New Roman" w:hAnsi="Times New Roman" w:eastAsia="宋体"/>
+          <w:b w:val="0"/>
+          <w:sz w:val="24"/>
+        </w:rPr>
+        <w:t xml:space="preserve"> 本文只去除了完全相同的文本，未处理只相差个别字符的近似重复文本，可能仍有少量泄漏。</w:t>
+      </w:r>
+    </w:p>
+    <w:p>
+      <w:pPr>
+        <w:spacing w:line="360" w:lineRule="auto" w:after="0"/>
+        <w:ind w:firstLine="480"/>
+      </w:pPr>
+      <w:r>
+        <w:rPr>
+          <w:rFonts w:ascii="Times New Roman" w:hAnsi="Times New Roman" w:eastAsia="宋体"/>
+          <w:b w:val="0"/>
+          <w:sz w:val="24"/>
+        </w:rPr>
+        <w:t>（6）</w:t>
+      </w:r>
+      <w:r>
+        <w:rPr>
+          <w:rFonts w:ascii="Times New Roman" w:hAnsi="Times New Roman" w:eastAsia="宋体"/>
+          <w:b/>
+          <w:sz w:val="24"/>
+        </w:rPr>
+        <w:t>未进行系统的错误类型分析。</w:t>
+      </w:r>
+      <w:r>
+        <w:rPr>
+          <w:rFonts w:ascii="Times New Roman" w:hAnsi="Times New Roman" w:eastAsia="宋体"/>
+          <w:b w:val="0"/>
+          <w:sz w:val="24"/>
+        </w:rPr>
+        <w:t xml:space="preserve"> 本文未对错误样本按反讽、否定、专业术语等类型进行人工标注和统计检验，对模型错误原因的分析还不够深入。</w:t>
+      </w:r>
+    </w:p>
+    <w:p>
+      <w:pPr>
+        <w:spacing w:before="240" w:after="120"/>
+      </w:pPr>
+      <w:r>
+        <w:rPr>
+          <w:rFonts w:ascii="Times New Roman" w:hAnsi="Times New Roman" w:eastAsia="黑体"/>
+          <w:b/>
+          <w:sz w:val="28"/>
+        </w:rPr>
+        <w:t>5.3 研究展望</w:t>
+      </w:r>
+    </w:p>
+    <w:p>
+      <w:pPr>
+        <w:spacing w:line="360" w:lineRule="auto" w:after="0"/>
+        <w:ind w:firstLine="480"/>
+      </w:pPr>
+      <w:r>
+        <w:rPr>
+          <w:rFonts w:ascii="Times New Roman" w:hAnsi="Times New Roman" w:eastAsia="宋体"/>
+          <w:b w:val="0"/>
+          <w:sz w:val="24"/>
+        </w:rPr>
+        <w:t>针对上述不足，未来可以从以下几个方面继续研究：</w:t>
+      </w:r>
+    </w:p>
+    <w:p>
+      <w:pPr>
+        <w:spacing w:line="360" w:lineRule="auto" w:after="0"/>
+        <w:ind w:firstLine="480"/>
+      </w:pPr>
+      <w:r>
+        <w:rPr>
+          <w:rFonts w:ascii="Times New Roman" w:hAnsi="Times New Roman" w:eastAsia="宋体"/>
+          <w:b w:val="0"/>
+          <w:sz w:val="24"/>
+        </w:rPr>
+        <w:t>（1）</w:t>
+      </w:r>
+      <w:r>
+        <w:rPr>
+          <w:rFonts w:ascii="Times New Roman" w:hAnsi="Times New Roman" w:eastAsia="宋体"/>
+          <w:b/>
+          <w:sz w:val="24"/>
+        </w:rPr>
+        <w:t>将情感分类结果用于股价预测。</w:t>
+      </w:r>
+      <w:r>
+        <w:rPr>
+          <w:rFonts w:ascii="Times New Roman" w:hAnsi="Times New Roman" w:eastAsia="宋体"/>
+          <w:b w:val="0"/>
+          <w:sz w:val="24"/>
+        </w:rPr>
+        <w:t xml:space="preserve"> 本文得到的情感分类模型可以用于对股吧等平台的帖子进行大规模自动标注，再按个股和交易日汇总为投资者情绪指数，检验其对股票收益率、成交量和波动率的预测能力。这需要爬取帖子数据并与行情数据对齐，是本文最直接的后续工作。</w:t>
+      </w:r>
+    </w:p>
+    <w:p>
+      <w:pPr>
+        <w:spacing w:line="360" w:lineRule="auto" w:after="0"/>
+        <w:ind w:firstLine="480"/>
+      </w:pPr>
+      <w:r>
+        <w:rPr>
+          <w:rFonts w:ascii="Times New Roman" w:hAnsi="Times New Roman" w:eastAsia="宋体"/>
+          <w:b w:val="0"/>
+          <w:sz w:val="24"/>
+        </w:rPr>
+        <w:t>（2）</w:t>
+      </w:r>
+      <w:r>
+        <w:rPr>
+          <w:rFonts w:ascii="Times New Roman" w:hAnsi="Times New Roman" w:eastAsia="宋体"/>
+          <w:b/>
+          <w:sz w:val="24"/>
+        </w:rPr>
+        <w:t>扩展到更多数据和任务。</w:t>
+      </w:r>
+      <w:r>
+        <w:rPr>
+          <w:rFonts w:ascii="Times New Roman" w:hAnsi="Times New Roman" w:eastAsia="宋体"/>
+          <w:b w:val="0"/>
+          <w:sz w:val="24"/>
+        </w:rPr>
+        <w:t xml:space="preserve"> 在金融新闻、研究报告等多种文本上检验结论的普适性，并尝试细粒度的情感强度分析或面向实体的情感分析。</w:t>
+      </w:r>
+    </w:p>
+    <w:p>
+      <w:pPr>
+        <w:spacing w:line="360" w:lineRule="auto" w:after="0"/>
+        <w:ind w:firstLine="480"/>
+      </w:pPr>
+      <w:r>
+        <w:rPr>
+          <w:rFonts w:ascii="Times New Roman" w:hAnsi="Times New Roman" w:eastAsia="宋体"/>
+          <w:b w:val="0"/>
+          <w:sz w:val="24"/>
+        </w:rPr>
+        <w:t>（3）</w:t>
+      </w:r>
+      <w:r>
+        <w:rPr>
+          <w:rFonts w:ascii="Times New Roman" w:hAnsi="Times New Roman" w:eastAsia="宋体"/>
+          <w:b/>
+          <w:sz w:val="24"/>
+        </w:rPr>
+        <w:t>改进中性类的识别和标注。</w:t>
+      </w:r>
+      <w:r>
+        <w:rPr>
+          <w:rFonts w:ascii="Times New Roman" w:hAnsi="Times New Roman" w:eastAsia="宋体"/>
+          <w:b w:val="0"/>
+          <w:sz w:val="24"/>
+        </w:rPr>
+        <w:t xml:space="preserve"> 可以对中性类样本进行多人重新标注，或采用软标签、标签平滑等对噪声更稳健的训练方法，以缓解标注模糊带来的影响。</w:t>
+      </w:r>
+    </w:p>
+    <w:p>
+      <w:pPr>
+        <w:spacing w:line="360" w:lineRule="auto" w:after="0"/>
+        <w:ind w:firstLine="480"/>
+      </w:pPr>
+      <w:r>
+        <w:rPr>
+          <w:rFonts w:ascii="Times New Roman" w:hAnsi="Times New Roman" w:eastAsia="宋体"/>
+          <w:b w:val="0"/>
+          <w:sz w:val="24"/>
+        </w:rPr>
+        <w:t>（4）</w:t>
+      </w:r>
+      <w:r>
+        <w:rPr>
+          <w:rFonts w:ascii="Times New Roman" w:hAnsi="Times New Roman" w:eastAsia="宋体"/>
+          <w:b/>
+          <w:sz w:val="24"/>
+        </w:rPr>
+        <w:t>更完善的不确定性评估。</w:t>
+      </w:r>
+      <w:r>
+        <w:rPr>
+          <w:rFonts w:ascii="Times New Roman" w:hAnsi="Times New Roman" w:eastAsia="宋体"/>
+          <w:b w:val="0"/>
+          <w:sz w:val="24"/>
+        </w:rPr>
+        <w:t xml:space="preserve"> 增加随机种子数量，或采用 LoRA 集成等方法，更精确地估计训练随机性，并进一步改进大模型的校准效果。</w:t>
+      </w:r>
+    </w:p>
+    <w:p>
+      <w:pPr>
+        <w:spacing w:line="360" w:lineRule="auto" w:after="0"/>
+        <w:ind w:firstLine="480"/>
+      </w:pPr>
+      <w:r>
+        <w:rPr>
+          <w:rFonts w:ascii="Times New Roman" w:hAnsi="Times New Roman" w:eastAsia="宋体"/>
+          <w:b w:val="0"/>
+          <w:sz w:val="24"/>
+        </w:rPr>
+        <w:t>（5）</w:t>
+      </w:r>
+      <w:r>
+        <w:rPr>
+          <w:rFonts w:ascii="Times New Roman" w:hAnsi="Times New Roman" w:eastAsia="宋体"/>
+          <w:b/>
+          <w:sz w:val="24"/>
+        </w:rPr>
+        <w:t>比较不同规模的模型。</w:t>
+      </w:r>
+      <w:r>
+        <w:rPr>
+          <w:rFonts w:ascii="Times New Roman" w:hAnsi="Times New Roman" w:eastAsia="宋体"/>
+          <w:b w:val="0"/>
+          <w:sz w:val="24"/>
+        </w:rPr>
+        <w:t xml:space="preserve"> 在同一模型系列中比较不同参数规模的效果与成本，为资源受限情况下的模型选型提供更全面的参考。</w:t>
+      </w:r>
+    </w:p>
+    <w:p>
+      <w:pPr>
+        <w:spacing w:after="360"/>
+        <w:jc w:val="center"/>
+      </w:pPr>
+      <w:r>
+        <w:rPr>
+          <w:rFonts w:ascii="Times New Roman" w:hAnsi="Times New Roman" w:eastAsia="黑体"/>
+          <w:b/>
+          <w:sz w:val="36"/>
+        </w:rPr>
+        <w:t>参考文献</w:t>
       </w:r>
     </w:p>
     <w:p>
@@ -15292,7 +15850,7 @@
           <w:b w:val="0"/>
           <w:sz w:val="21"/>
         </w:rPr>
-        <w:t>[Chen 等, 2023] Chen W, Wang Q, Long Z, et al. DISC-FinLLM: A Chinese financial large language model based on multiple experts fine-tuning[J]. arXiv preprint arXiv:2310.15205, 2023.</w:t>
+        <w:t>[1] Tetlock P C. Giving content to investor sentiment: The role of media in the stock market[J]. The Journal of Finance, 2007, 62(3): 1139-1168.</w:t>
       </w:r>
     </w:p>
     <w:p>
@@ -15306,7 +15864,7 @@
           <w:b w:val="0"/>
           <w:sz w:val="21"/>
         </w:rPr>
-        <w:t>[Cui 等, 2021] Cui Y, Che W, Liu T, et al. Pre-training with whole word masking for Chinese BERT[J]. IEEE/ACM Transactions on Audio, Speech, and Language Processing, 2021, 29: 3504-3514.</w:t>
+        <w:t>[2] 游家兴, 吴静. 沉默的螺旋：媒体情绪与资产误定价[J]. 经济研究, 2012, 47(7): 141-152.</w:t>
       </w:r>
     </w:p>
     <w:p>
@@ -15320,7 +15878,7 @@
           <w:b w:val="0"/>
           <w:sz w:val="21"/>
         </w:rPr>
-        <w:t>[Dettmers 等, 2023] Dettmers T, Pagnoni A, Holtzman A, et al. QLoRA: Efficient finetuning of quantized LLMs[C]. Advances in Neural Information Processing Systems, 2023.</w:t>
+        <w:t>[3] 段江娇, 刘红忠, 曾剑平. 中国股票网络论坛的信息含量分析[J]. 金融研究, 2017(10): 178-192.</w:t>
       </w:r>
     </w:p>
     <w:p>
@@ -15334,7 +15892,7 @@
           <w:b w:val="0"/>
           <w:sz w:val="21"/>
         </w:rPr>
-        <w:t>[Devlin 等, 2019] Devlin J, Chang M W, Lee K, et al. BERT: Pre-training of deep bidirectional transformers for language understanding[C]. Proceedings of NAACL-HLT, 2019: 4171-4186.</w:t>
+        <w:t>[4] 部慧, 解峥, 李佳鸿, 吴俊杰. 基于股评的投资者情绪对股票市场的影响[J]. 管理科学学报, 2018, 21(4): 86-101.</w:t>
       </w:r>
     </w:p>
     <w:p>
@@ -15348,7 +15906,7 @@
           <w:b w:val="0"/>
           <w:sz w:val="21"/>
         </w:rPr>
-        <w:t>[Efron 和 Tibshirani, 1993] Efron B, Tibshirani R J. An Introduction to the Bootstrap[M]. New York: Chapman &amp; Hall, 1993.</w:t>
+        <w:t>[5] 沈艳, 陈赟, 黄卓. 文本大数据分析在经济学和金融学中的应用：一个文献综述[J]. 经济学(季刊), 2019, 18(4): 1153-1186.</w:t>
       </w:r>
     </w:p>
     <w:p>
@@ -15362,7 +15920,7 @@
           <w:b w:val="0"/>
           <w:sz w:val="21"/>
         </w:rPr>
-        <w:t>[Geifman 和 El-Yaniv, 2017] Geifman Y, El-Yaniv R. Selective classification for deep neural networks[C]. Advances in Neural Information Processing Systems, 2017.</w:t>
+        <w:t>[6] Loughran T, McDonald B. When is a liability not a liability? Textual analysis, dictionaries, and 10-Ks[J]. The Journal of Finance, 2011, 66(1): 35-65.</w:t>
       </w:r>
     </w:p>
     <w:p>
@@ -15376,7 +15934,7 @@
           <w:b w:val="0"/>
           <w:sz w:val="21"/>
         </w:rPr>
-        <w:t>[Guo 等, 2017] Guo C, Pleiss G, Sun Y, et al. On calibration of modern neural networks[C]. Proceedings of the 34th International Conference on Machine Learning, 2017: 1321-1330.</w:t>
+        <w:t>[7] Devlin J, Chang M W, Lee K, et al. BERT: Pre-training of deep bidirectional transformers for language understanding[C]//Proceedings of NAACL-HLT. 2019: 4171-4186.</w:t>
       </w:r>
     </w:p>
     <w:p>
@@ -15390,7 +15948,7 @@
           <w:b w:val="0"/>
           <w:sz w:val="21"/>
         </w:rPr>
-        <w:t>[Holm, 1979] Holm S. A simple sequentially rejective multiple test procedure[J]. Scandinavian Journal of Statistics, 1979, 6(2): 65-70.</w:t>
+        <w:t>[8] Araci D. FinBERT: Financial sentiment analysis with pre-trained language models[J]. arXiv preprint arXiv:1908.10063, 2019.</w:t>
       </w:r>
     </w:p>
     <w:p>
@@ -15404,7 +15962,7 @@
           <w:b w:val="0"/>
           <w:sz w:val="21"/>
         </w:rPr>
-        <w:t>[Hu 等, 2022] Hu E J, Shen Y, Wallis P, et al. LoRA: Low-rank adaptation of large language models[C]. International Conference on Learning Representations, 2022.</w:t>
+        <w:t>[9] Cui Y, Che W, Liu T, et al. Pre-training with whole word masking for Chinese BERT[J]. IEEE/ACM Transactions on Audio, Speech, and Language Processing, 2021, 29: 3504-3514.</w:t>
       </w:r>
     </w:p>
     <w:p>
@@ -15418,7 +15976,7 @@
           <w:b w:val="0"/>
           <w:sz w:val="21"/>
         </w:rPr>
-        <w:t>[Lu 等, 2023] Lu D, Wu H, Liang J, et al. BBT-Fin: Comprehensive construction of Chinese financial domain pre-trained language model, corpus and benchmark[J]. arXiv preprint arXiv:2302.09432, 2023.</w:t>
+        <w:t>[10] Brown T, Mann B, Ryder N, et al. Language models are few-shot learners[C]//Advances in Neural Information Processing Systems. 2020: 1877-1901.</w:t>
       </w:r>
     </w:p>
     <w:p>
@@ -15432,578 +15990,7 @@
           <w:b w:val="0"/>
           <w:sz w:val="21"/>
         </w:rPr>
-        <w:t>[McNemar, 1947] McNemar Q. Note on the sampling error of the difference between correlated proportions or percentages[J]. Psychometrika, 1947, 12(2): 153-157.</w:t>
-      </w:r>
-    </w:p>
-    <w:p>
-      <w:pPr>
-        <w:spacing w:after="360"/>
-        <w:jc w:val="center"/>
-      </w:pPr>
-      <w:r>
-        <w:rPr>
-          <w:rFonts w:ascii="Times New Roman" w:hAnsi="Times New Roman" w:eastAsia="黑体"/>
-          <w:b/>
-          <w:sz w:val="36"/>
-        </w:rPr>
-        <w:t>第5章 结论与展望</w:t>
-      </w:r>
-    </w:p>
-    <w:p>
-      <w:pPr>
-        <w:spacing w:before="240" w:after="120"/>
-      </w:pPr>
-      <w:r>
-        <w:rPr>
-          <w:rFonts w:ascii="Times New Roman" w:hAnsi="Times New Roman" w:eastAsia="黑体"/>
-          <w:b/>
-          <w:sz w:val="28"/>
-        </w:rPr>
-        <w:t>5.1 主要结论</w:t>
-      </w:r>
-    </w:p>
-    <w:p>
-      <w:pPr>
-        <w:spacing w:line="360" w:lineRule="auto" w:after="0"/>
-        <w:ind w:firstLine="480"/>
-      </w:pPr>
-      <w:r>
-        <w:rPr>
-          <w:rFonts w:ascii="Times New Roman" w:hAnsi="Times New Roman" w:eastAsia="宋体"/>
-          <w:b w:val="0"/>
-          <w:sz w:val="24"/>
-        </w:rPr>
-        <w:t>本文以中文金融社交媒体情感分类数据集 FinFE 为对象，在单张 RTX 3090 显卡上系统比较了传统机器学习、预训练语言模型和开源大语言模型三类方法，并从统计推断、置信度可靠性和数据质量三个角度对结果进行了分析。主要结论如下。</w:t>
-      </w:r>
-    </w:p>
-    <w:p>
-      <w:pPr>
-        <w:spacing w:line="360" w:lineRule="auto" w:after="0"/>
-        <w:ind w:firstLine="480"/>
-      </w:pPr>
-      <w:r>
-        <w:rPr>
-          <w:rFonts w:ascii="Times New Roman" w:hAnsi="Times New Roman" w:eastAsia="宋体"/>
-          <w:b/>
-          <w:sz w:val="24"/>
-        </w:rPr>
-        <w:t>（1）公开基准存在明显的数据质量问题，必须先清洗再评估。</w:t>
-      </w:r>
-      <w:r>
-        <w:rPr>
-          <w:rFonts w:ascii="Times New Roman" w:hAnsi="Times New Roman" w:eastAsia="宋体"/>
-          <w:b w:val="0"/>
-          <w:sz w:val="24"/>
-        </w:rPr>
-        <w:t xml:space="preserve"> FinFE 公开评估集中有 1092 条文本原样出现在训练文件中，其中 228 条标签不一致。如果直接使用公开文件，模型对见过的原句准确率可达 93%～97%，TF-IDF 基线的宏平均 F1 虚高 8.1 个百分点，TF-IDF 与 RoBERTa 的真实差距被缩小约三分之二。经去重和重新划分后，本文得到无泄漏的训练集、验证集和测试集（8802 / 979 / 1713 条）。</w:t>
-      </w:r>
-    </w:p>
-    <w:p>
-      <w:pPr>
-        <w:spacing w:line="360" w:lineRule="auto" w:after="0"/>
-        <w:ind w:firstLine="480"/>
-      </w:pPr>
-      <w:r>
-        <w:rPr>
-          <w:rFonts w:ascii="Times New Roman" w:hAnsi="Times New Roman" w:eastAsia="宋体"/>
-          <w:b/>
-          <w:sz w:val="24"/>
-        </w:rPr>
-        <w:t>（2）LoRA 微调的大模型取得了最好的分类效果，但领先幅度较小。</w:t>
-      </w:r>
-      <w:r>
-        <w:rPr>
-          <w:rFonts w:ascii="Times New Roman" w:hAnsi="Times New Roman" w:eastAsia="宋体"/>
-          <w:b w:val="0"/>
-          <w:sz w:val="24"/>
-        </w:rPr>
-        <w:t xml:space="preserve"> 在清洗后的测试集上，TF-IDF 基线的宏平均 F1 约为 0.70，RoBERTa-wwm-ext 约为 0.778，三个 LoRA 微调大模型为 0.798～0.807。零样本和少样本提示的大模型 F1 只有 0.63～0.70，不如微调后的 RoBERTa，说明在该任务上有监督微调仍然必要。三个大模型之间的差异不显著（方差分析 p = 0.14）。</w:t>
-      </w:r>
-    </w:p>
-    <w:p>
-      <w:pPr>
-        <w:spacing w:line="360" w:lineRule="auto" w:after="0"/>
-        <w:ind w:firstLine="480"/>
-      </w:pPr>
-      <w:r>
-        <w:rPr>
-          <w:rFonts w:ascii="Times New Roman" w:hAnsi="Times New Roman" w:eastAsia="宋体"/>
-          <w:b/>
-          <w:sz w:val="24"/>
-        </w:rPr>
-        <w:t>（3）统计显著性的结论取决于所考虑的不确定性来源。</w:t>
-      </w:r>
-      <w:r>
-        <w:rPr>
-          <w:rFonts w:ascii="Times New Roman" w:hAnsi="Times New Roman" w:eastAsia="宋体"/>
-          <w:b w:val="0"/>
-          <w:sz w:val="24"/>
-        </w:rPr>
-        <w:t xml:space="preserve"> 以 3 个随机种子反映训练随机性时，三个 LoRA 大模型都显著优于 RoBERTa（Tukey 检验 p = 0.0014～0.021）；以测试样本抽样误差为依据时，McNemar 检验经 Holm 校正后不显著（p = 0.55～0.69），配对 Bootstrap 的 F1 差值约为 0.018～0.019，95% 置信区间下限接近或略低于 0。因此，LoRA 大模型的优势是稳定的，但幅度只有约 2 个百分点，在 1713 条的测试集上难以被严格证实。</w:t>
-      </w:r>
-    </w:p>
-    <w:p>
-      <w:pPr>
-        <w:spacing w:line="360" w:lineRule="auto" w:after="0"/>
-        <w:ind w:firstLine="480"/>
-      </w:pPr>
-      <w:r>
-        <w:rPr>
-          <w:rFonts w:ascii="Times New Roman" w:hAnsi="Times New Roman" w:eastAsia="宋体"/>
-          <w:b/>
-          <w:sz w:val="24"/>
-        </w:rPr>
-        <w:t>（4）零样本大模型严重过度自信，微调和温度缩放可以有效改善。</w:t>
-      </w:r>
-      <w:r>
-        <w:rPr>
-          <w:rFonts w:ascii="Times New Roman" w:hAnsi="Times New Roman" w:eastAsia="宋体"/>
-          <w:b w:val="0"/>
-          <w:sz w:val="24"/>
-        </w:rPr>
-        <w:t xml:space="preserve"> 零样本 Qwen3-8B 的平均置信度为 96.4%，而准确率只有 67.1%，ECE 为 0.294；LoRA 微调后 ECE 降至 0.035～0.085，再经温度缩放可降至 0.013～0.030。选择性预测结果表明，LoRA 大模型只处理置信度最高的 50% 样本时准确率约为 96%，处理 80% 样本时约为 89%，AURC 优于 RoBERTa，适合“模型处理高置信度样本、人工复核低置信度样本”的应用方式。</w:t>
-      </w:r>
-    </w:p>
-    <w:p>
-      <w:pPr>
-        <w:spacing w:line="360" w:lineRule="auto" w:after="0"/>
-        <w:ind w:firstLine="480"/>
-      </w:pPr>
-      <w:r>
-        <w:rPr>
-          <w:rFonts w:ascii="Times New Roman" w:hAnsi="Times New Roman" w:eastAsia="宋体"/>
-          <w:b/>
-          <w:sz w:val="24"/>
-        </w:rPr>
-        <w:t>（5）LoRA 微调对超参数不敏感，资源需求较低。</w:t>
-      </w:r>
-      <w:r>
-        <w:rPr>
-          <w:rFonts w:ascii="Times New Roman" w:hAnsi="Times New Roman" w:eastAsia="宋体"/>
-          <w:b w:val="0"/>
-          <w:sz w:val="24"/>
-        </w:rPr>
-        <w:t xml:space="preserve"> 训练样本量从 500 条增加到全量，F1 从 0.766 提升到 0.800，边际收益逐渐递减；LoRA 秩在 4～32 之间变化时 F1 稳定在 0.798～0.809；4 比特 QLoRA 的 F1 为 0.807，与 16 位精度相当，峰值显存仅 11.2 GB。</w:t>
-      </w:r>
-    </w:p>
-    <w:p>
-      <w:pPr>
-        <w:spacing w:line="360" w:lineRule="auto" w:after="0"/>
-        <w:ind w:firstLine="480"/>
-      </w:pPr>
-      <w:r>
-        <w:rPr>
-          <w:rFonts w:ascii="Times New Roman" w:hAnsi="Times New Roman" w:eastAsia="宋体"/>
-          <w:b/>
-          <w:sz w:val="24"/>
-        </w:rPr>
-        <w:t>（6）标注噪声限制了可达到的准确率，中性类是主要难点。</w:t>
-      </w:r>
-      <w:r>
-        <w:rPr>
-          <w:rFonts w:ascii="Times New Roman" w:hAnsi="Times New Roman" w:eastAsia="宋体"/>
-          <w:b w:val="0"/>
-          <w:sz w:val="24"/>
-        </w:rPr>
-        <w:t xml:space="preserve"> 利用重复标注样本估计，标注一致率为 82.9%（κ = 0.735），标注准确率约为 91%，可视为模型准确率的近似上限。所有模型的中性类 F1 都只有 0.69 左右，而 82% 的标注冲突涉及中性类，说明中性类识别困难在很大程度上来自标注本身的模糊性，而不仅是模型能力不足。</w:t>
-      </w:r>
-    </w:p>
-    <w:p>
-      <w:pPr>
-        <w:spacing w:before="240" w:after="120"/>
-      </w:pPr>
-      <w:r>
-        <w:rPr>
-          <w:rFonts w:ascii="Times New Roman" w:hAnsi="Times New Roman" w:eastAsia="黑体"/>
-          <w:b/>
-          <w:sz w:val="28"/>
-        </w:rPr>
-        <w:t>5.2 研究不足</w:t>
-      </w:r>
-    </w:p>
-    <w:p>
-      <w:pPr>
-        <w:spacing w:line="360" w:lineRule="auto" w:after="0"/>
-        <w:ind w:firstLine="480"/>
-      </w:pPr>
-      <w:r>
-        <w:rPr>
-          <w:rFonts w:ascii="Times New Roman" w:hAnsi="Times New Roman" w:eastAsia="宋体"/>
-          <w:b w:val="0"/>
-          <w:sz w:val="24"/>
-        </w:rPr>
-        <w:t>本文仍存在以下不足：</w:t>
-      </w:r>
-    </w:p>
-    <w:p>
-      <w:pPr>
-        <w:spacing w:line="360" w:lineRule="auto" w:after="0"/>
-        <w:ind w:firstLine="480"/>
-      </w:pPr>
-      <w:r>
-        <w:rPr>
-          <w:rFonts w:ascii="Times New Roman" w:hAnsi="Times New Roman" w:eastAsia="宋体"/>
-          <w:b w:val="0"/>
-          <w:sz w:val="24"/>
-        </w:rPr>
-        <w:t>（1）</w:t>
-      </w:r>
-      <w:r>
-        <w:rPr>
-          <w:rFonts w:ascii="Times New Roman" w:hAnsi="Times New Roman" w:eastAsia="宋体"/>
-          <w:b/>
-          <w:sz w:val="24"/>
-        </w:rPr>
-        <w:t>只使用了一个数据集。</w:t>
-      </w:r>
-      <w:r>
-        <w:rPr>
-          <w:rFonts w:ascii="Times New Roman" w:hAnsi="Times New Roman" w:eastAsia="宋体"/>
-          <w:b w:val="0"/>
-          <w:sz w:val="24"/>
-        </w:rPr>
-        <w:t xml:space="preserve"> 本文的结论基于 FinFE 这一中文金融社交媒体数据集，是否适用于金融新闻、研究报告、上市公司公告等其他类型的文本，还需要进一步验证。</w:t>
-      </w:r>
-    </w:p>
-    <w:p>
-      <w:pPr>
-        <w:spacing w:line="360" w:lineRule="auto" w:after="0"/>
-        <w:ind w:firstLine="480"/>
-      </w:pPr>
-      <w:r>
-        <w:rPr>
-          <w:rFonts w:ascii="Times New Roman" w:hAnsi="Times New Roman" w:eastAsia="宋体"/>
-          <w:b w:val="0"/>
-          <w:sz w:val="24"/>
-        </w:rPr>
-        <w:t>（2）</w:t>
-      </w:r>
-      <w:r>
-        <w:rPr>
-          <w:rFonts w:ascii="Times New Roman" w:hAnsi="Times New Roman" w:eastAsia="宋体"/>
-          <w:b/>
-          <w:sz w:val="24"/>
-        </w:rPr>
-        <w:t>随机种子数量较少。</w:t>
-      </w:r>
-      <w:r>
-        <w:rPr>
-          <w:rFonts w:ascii="Times New Roman" w:hAnsi="Times New Roman" w:eastAsia="宋体"/>
-          <w:b w:val="0"/>
-          <w:sz w:val="24"/>
-        </w:rPr>
-        <w:t xml:space="preserve"> 受计算资源限制，每个模型只进行了 3 次独立训练，方差分析的自由度较小，对训练随机性的估计不够精确。</w:t>
-      </w:r>
-    </w:p>
-    <w:p>
-      <w:pPr>
-        <w:spacing w:line="360" w:lineRule="auto" w:after="0"/>
-        <w:ind w:firstLine="480"/>
-      </w:pPr>
-      <w:r>
-        <w:rPr>
-          <w:rFonts w:ascii="Times New Roman" w:hAnsi="Times New Roman" w:eastAsia="宋体"/>
-          <w:b w:val="0"/>
-          <w:sz w:val="24"/>
-        </w:rPr>
-        <w:t>（3）</w:t>
-      </w:r>
-      <w:r>
-        <w:rPr>
-          <w:rFonts w:ascii="Times New Roman" w:hAnsi="Times New Roman" w:eastAsia="宋体"/>
-          <w:b/>
-          <w:sz w:val="24"/>
-        </w:rPr>
-        <w:t>研究计划有所调整。</w:t>
-      </w:r>
-      <w:r>
-        <w:rPr>
-          <w:rFonts w:ascii="Times New Roman" w:hAnsi="Times New Roman" w:eastAsia="宋体"/>
-          <w:b w:val="0"/>
-          <w:sz w:val="24"/>
-        </w:rPr>
-        <w:t xml:space="preserve"> 开题时计划比较同一系列不同规模的模型（Qwen3-1.7B、4B、8B），并在 7 个样本量上各重复 3 次绘制学习曲线。实际实验中，模型比较改为三个不同系列、规模相近（7B～9B）的模型，样本量实验也只在少数几个规模上各进行了一次，因此未能系统分析模型规模的影响，学习曲线也较为粗略。</w:t>
-      </w:r>
-    </w:p>
-    <w:p>
-      <w:pPr>
-        <w:spacing w:line="360" w:lineRule="auto" w:after="0"/>
-        <w:ind w:firstLine="480"/>
-      </w:pPr>
-      <w:r>
-        <w:rPr>
-          <w:rFonts w:ascii="Times New Roman" w:hAnsi="Times New Roman" w:eastAsia="宋体"/>
-          <w:b w:val="0"/>
-          <w:sz w:val="24"/>
-        </w:rPr>
-        <w:t>（4）</w:t>
-      </w:r>
-      <w:r>
-        <w:rPr>
-          <w:rFonts w:ascii="Times New Roman" w:hAnsi="Times New Roman" w:eastAsia="宋体"/>
-          <w:b/>
-          <w:sz w:val="24"/>
-        </w:rPr>
-        <w:t>标注噪声的估计较为粗略。</w:t>
-      </w:r>
-      <w:r>
-        <w:rPr>
-          <w:rFonts w:ascii="Times New Roman" w:hAnsi="Times New Roman" w:eastAsia="宋体"/>
-          <w:b w:val="0"/>
-          <w:sz w:val="24"/>
-        </w:rPr>
-        <w:t xml:space="preserve"> 91% 的上限基于“各类别错误概率相同”的简化噪声模型，且被重复标注的文本平均更短，并非随机样本，因此只能作为近似参考。</w:t>
-      </w:r>
-    </w:p>
-    <w:p>
-      <w:pPr>
-        <w:spacing w:line="360" w:lineRule="auto" w:after="0"/>
-        <w:ind w:firstLine="480"/>
-      </w:pPr>
-      <w:r>
-        <w:rPr>
-          <w:rFonts w:ascii="Times New Roman" w:hAnsi="Times New Roman" w:eastAsia="宋体"/>
-          <w:b w:val="0"/>
-          <w:sz w:val="24"/>
-        </w:rPr>
-        <w:t>（5）</w:t>
-      </w:r>
-      <w:r>
-        <w:rPr>
-          <w:rFonts w:ascii="Times New Roman" w:hAnsi="Times New Roman" w:eastAsia="宋体"/>
-          <w:b/>
-          <w:sz w:val="24"/>
-        </w:rPr>
-        <w:t>测试集中存在近似重复。</w:t>
-      </w:r>
-      <w:r>
-        <w:rPr>
-          <w:rFonts w:ascii="Times New Roman" w:hAnsi="Times New Roman" w:eastAsia="宋体"/>
-          <w:b w:val="0"/>
-          <w:sz w:val="24"/>
-        </w:rPr>
-        <w:t xml:space="preserve"> 本文只去除了完全相同的文本，未处理只相差个别字符的近似重复文本，可能仍有少量泄漏。</w:t>
-      </w:r>
-    </w:p>
-    <w:p>
-      <w:pPr>
-        <w:spacing w:line="360" w:lineRule="auto" w:after="0"/>
-        <w:ind w:firstLine="480"/>
-      </w:pPr>
-      <w:r>
-        <w:rPr>
-          <w:rFonts w:ascii="Times New Roman" w:hAnsi="Times New Roman" w:eastAsia="宋体"/>
-          <w:b w:val="0"/>
-          <w:sz w:val="24"/>
-        </w:rPr>
-        <w:t>（6）</w:t>
-      </w:r>
-      <w:r>
-        <w:rPr>
-          <w:rFonts w:ascii="Times New Roman" w:hAnsi="Times New Roman" w:eastAsia="宋体"/>
-          <w:b/>
-          <w:sz w:val="24"/>
-        </w:rPr>
-        <w:t>未进行系统的错误类型分析。</w:t>
-      </w:r>
-      <w:r>
-        <w:rPr>
-          <w:rFonts w:ascii="Times New Roman" w:hAnsi="Times New Roman" w:eastAsia="宋体"/>
-          <w:b w:val="0"/>
-          <w:sz w:val="24"/>
-        </w:rPr>
-        <w:t xml:space="preserve"> 本文未对错误样本按反讽、否定、专业术语等类型进行人工标注和统计检验，对模型错误原因的分析还不够深入。</w:t>
-      </w:r>
-    </w:p>
-    <w:p>
-      <w:pPr>
-        <w:spacing w:before="240" w:after="120"/>
-      </w:pPr>
-      <w:r>
-        <w:rPr>
-          <w:rFonts w:ascii="Times New Roman" w:hAnsi="Times New Roman" w:eastAsia="黑体"/>
-          <w:b/>
-          <w:sz w:val="28"/>
-        </w:rPr>
-        <w:t>5.3 研究展望</w:t>
-      </w:r>
-    </w:p>
-    <w:p>
-      <w:pPr>
-        <w:spacing w:line="360" w:lineRule="auto" w:after="0"/>
-        <w:ind w:firstLine="480"/>
-      </w:pPr>
-      <w:r>
-        <w:rPr>
-          <w:rFonts w:ascii="Times New Roman" w:hAnsi="Times New Roman" w:eastAsia="宋体"/>
-          <w:b w:val="0"/>
-          <w:sz w:val="24"/>
-        </w:rPr>
-        <w:t>针对上述不足，未来可以从以下几个方面继续研究：</w:t>
-      </w:r>
-    </w:p>
-    <w:p>
-      <w:pPr>
-        <w:spacing w:line="360" w:lineRule="auto" w:after="0"/>
-        <w:ind w:firstLine="480"/>
-      </w:pPr>
-      <w:r>
-        <w:rPr>
-          <w:rFonts w:ascii="Times New Roman" w:hAnsi="Times New Roman" w:eastAsia="宋体"/>
-          <w:b w:val="0"/>
-          <w:sz w:val="24"/>
-        </w:rPr>
-        <w:t>（1）</w:t>
-      </w:r>
-      <w:r>
-        <w:rPr>
-          <w:rFonts w:ascii="Times New Roman" w:hAnsi="Times New Roman" w:eastAsia="宋体"/>
-          <w:b/>
-          <w:sz w:val="24"/>
-        </w:rPr>
-        <w:t>将情感分类结果用于股价预测。</w:t>
-      </w:r>
-      <w:r>
-        <w:rPr>
-          <w:rFonts w:ascii="Times New Roman" w:hAnsi="Times New Roman" w:eastAsia="宋体"/>
-          <w:b w:val="0"/>
-          <w:sz w:val="24"/>
-        </w:rPr>
-        <w:t xml:space="preserve"> 本文得到的情感分类模型可以用于对股吧等平台的帖子进行大规模自动标注，再按个股和交易日汇总为投资者情绪指数，检验其对股票收益率、成交量和波动率的预测能力。这需要爬取帖子数据并与行情数据对齐，是本文最直接的后续工作。</w:t>
-      </w:r>
-    </w:p>
-    <w:p>
-      <w:pPr>
-        <w:spacing w:line="360" w:lineRule="auto" w:after="0"/>
-        <w:ind w:firstLine="480"/>
-      </w:pPr>
-      <w:r>
-        <w:rPr>
-          <w:rFonts w:ascii="Times New Roman" w:hAnsi="Times New Roman" w:eastAsia="宋体"/>
-          <w:b w:val="0"/>
-          <w:sz w:val="24"/>
-        </w:rPr>
-        <w:t>（2）</w:t>
-      </w:r>
-      <w:r>
-        <w:rPr>
-          <w:rFonts w:ascii="Times New Roman" w:hAnsi="Times New Roman" w:eastAsia="宋体"/>
-          <w:b/>
-          <w:sz w:val="24"/>
-        </w:rPr>
-        <w:t>扩展到更多数据和任务。</w:t>
-      </w:r>
-      <w:r>
-        <w:rPr>
-          <w:rFonts w:ascii="Times New Roman" w:hAnsi="Times New Roman" w:eastAsia="宋体"/>
-          <w:b w:val="0"/>
-          <w:sz w:val="24"/>
-        </w:rPr>
-        <w:t xml:space="preserve"> 在金融新闻、研究报告等多种文本上检验结论的普适性，并尝试细粒度的情感强度分析或面向实体的情感分析。</w:t>
-      </w:r>
-    </w:p>
-    <w:p>
-      <w:pPr>
-        <w:spacing w:line="360" w:lineRule="auto" w:after="0"/>
-        <w:ind w:firstLine="480"/>
-      </w:pPr>
-      <w:r>
-        <w:rPr>
-          <w:rFonts w:ascii="Times New Roman" w:hAnsi="Times New Roman" w:eastAsia="宋体"/>
-          <w:b w:val="0"/>
-          <w:sz w:val="24"/>
-        </w:rPr>
-        <w:t>（3）</w:t>
-      </w:r>
-      <w:r>
-        <w:rPr>
-          <w:rFonts w:ascii="Times New Roman" w:hAnsi="Times New Roman" w:eastAsia="宋体"/>
-          <w:b/>
-          <w:sz w:val="24"/>
-        </w:rPr>
-        <w:t>改进中性类的识别和标注。</w:t>
-      </w:r>
-      <w:r>
-        <w:rPr>
-          <w:rFonts w:ascii="Times New Roman" w:hAnsi="Times New Roman" w:eastAsia="宋体"/>
-          <w:b w:val="0"/>
-          <w:sz w:val="24"/>
-        </w:rPr>
-        <w:t xml:space="preserve"> 可以对中性类样本进行多人重新标注，或采用软标签、标签平滑等对噪声更稳健的训练方法，以缓解标注模糊带来的影响。</w:t>
-      </w:r>
-    </w:p>
-    <w:p>
-      <w:pPr>
-        <w:spacing w:line="360" w:lineRule="auto" w:after="0"/>
-        <w:ind w:firstLine="480"/>
-      </w:pPr>
-      <w:r>
-        <w:rPr>
-          <w:rFonts w:ascii="Times New Roman" w:hAnsi="Times New Roman" w:eastAsia="宋体"/>
-          <w:b w:val="0"/>
-          <w:sz w:val="24"/>
-        </w:rPr>
-        <w:t>（4）</w:t>
-      </w:r>
-      <w:r>
-        <w:rPr>
-          <w:rFonts w:ascii="Times New Roman" w:hAnsi="Times New Roman" w:eastAsia="宋体"/>
-          <w:b/>
-          <w:sz w:val="24"/>
-        </w:rPr>
-        <w:t>更完善的不确定性评估。</w:t>
-      </w:r>
-      <w:r>
-        <w:rPr>
-          <w:rFonts w:ascii="Times New Roman" w:hAnsi="Times New Roman" w:eastAsia="宋体"/>
-          <w:b w:val="0"/>
-          <w:sz w:val="24"/>
-        </w:rPr>
-        <w:t xml:space="preserve"> 增加随机种子数量，或采用 LoRA 集成等方法，更精确地估计训练随机性，并进一步改进大模型的校准效果。</w:t>
-      </w:r>
-    </w:p>
-    <w:p>
-      <w:pPr>
-        <w:spacing w:line="360" w:lineRule="auto" w:after="0"/>
-        <w:ind w:firstLine="480"/>
-      </w:pPr>
-      <w:r>
-        <w:rPr>
-          <w:rFonts w:ascii="Times New Roman" w:hAnsi="Times New Roman" w:eastAsia="宋体"/>
-          <w:b w:val="0"/>
-          <w:sz w:val="24"/>
-        </w:rPr>
-        <w:t>（5）</w:t>
-      </w:r>
-      <w:r>
-        <w:rPr>
-          <w:rFonts w:ascii="Times New Roman" w:hAnsi="Times New Roman" w:eastAsia="宋体"/>
-          <w:b/>
-          <w:sz w:val="24"/>
-        </w:rPr>
-        <w:t>比较不同规模的模型。</w:t>
-      </w:r>
-      <w:r>
-        <w:rPr>
-          <w:rFonts w:ascii="Times New Roman" w:hAnsi="Times New Roman" w:eastAsia="宋体"/>
-          <w:b w:val="0"/>
-          <w:sz w:val="24"/>
-        </w:rPr>
-        <w:t xml:space="preserve"> 在同一模型系列中比较不同参数规模的效果与成本，为资源受限情况下的模型选型提供更全面的参考。</w:t>
-      </w:r>
-    </w:p>
-    <w:p>
-      <w:pPr>
-        <w:spacing w:after="360"/>
-        <w:jc w:val="center"/>
-      </w:pPr>
-      <w:r>
-        <w:rPr>
-          <w:rFonts w:ascii="Times New Roman" w:hAnsi="Times New Roman" w:eastAsia="黑体"/>
-          <w:b/>
-          <w:sz w:val="36"/>
-        </w:rPr>
-        <w:t>参考文献</w:t>
+        <w:t>[11] Yang A, Li A, Yang B, et al. Qwen3 technical report[J]. arXiv preprint arXiv:2505.09388, 2025.</w:t>
       </w:r>
     </w:p>
     <w:p>
@@ -16017,7 +16004,7 @@
           <w:b w:val="0"/>
           <w:sz w:val="21"/>
         </w:rPr>
-        <w:t>[1] 沈艳, 陈赟, 黄卓. 文本大数据分析在经济学和金融学中的应用：一个文献综述[J]. 经济学(季刊), 2019, 18(4): 1153-1186.</w:t>
+        <w:t>[12] Wu S, Irsoy O, Lu S, et al. BloombergGPT: A large language model for finance[J]. arXiv preprint arXiv:2303.17564, 2023.</w:t>
       </w:r>
     </w:p>
     <w:p>
@@ -16031,7 +16018,7 @@
           <w:b w:val="0"/>
           <w:sz w:val="21"/>
         </w:rPr>
-        <w:t>[2] 游家兴, 吴静. 沉默的螺旋：媒体情绪与资产误定价[J]. 经济研究, 2012, 47(7): 141-152.</w:t>
+        <w:t>[13] Yang H, Liu X Y, Wang C D. FinGPT: Open-source financial large language models[J]. arXiv preprint arXiv:2306.06031, 2023.</w:t>
       </w:r>
     </w:p>
     <w:p>
@@ -16045,7 +16032,7 @@
           <w:b w:val="0"/>
           <w:sz w:val="21"/>
         </w:rPr>
-        <w:t>[3] 段江娇, 刘红忠, 曾剑平. 中国股票网络论坛的信息含量分析[J]. 金融研究, 2017(10): 178-192.</w:t>
+        <w:t>[14] Hu E J, Shen Y, Wallis P, et al. LoRA: Low-rank adaptation of large language models[C]//International Conference on Learning Representations. 2022.</w:t>
       </w:r>
     </w:p>
     <w:p>
@@ -16059,7 +16046,7 @@
           <w:b w:val="0"/>
           <w:sz w:val="21"/>
         </w:rPr>
-        <w:t>[4] 部慧, 解峥, 李佳鸿, 吴俊杰. 基于股评的投资者情绪对股票市场的影响[J]. 管理科学学报, 2018, 21(4): 86-101.</w:t>
+        <w:t>[15] Dettmers T, Pagnoni A, Holtzman A, et al. QLoRA: Efficient finetuning of quantized LLMs[C]//Advances in Neural Information Processing Systems. 2023.</w:t>
       </w:r>
     </w:p>
     <w:p>
@@ -16073,7 +16060,7 @@
           <w:b w:val="0"/>
           <w:sz w:val="21"/>
         </w:rPr>
-        <w:t>[5] 石善冲, 朱颖楠, 赵志刚, 康凯立, 熊熊. 基于微信文本挖掘的投资者情绪与股票市场表现[J]. 系统工程理论与实践, 2018, 38(6): 1404-1412.</w:t>
+        <w:t>[16] Malo P, Sinha A, Korhonen P, et al. Good debt or bad debt: Detecting semantic orientations in economic texts[J]. Journal of the Association for Information Science and Technology, 2014, 65(4): 782-796.</w:t>
       </w:r>
     </w:p>
     <w:p>
@@ -16087,7 +16074,7 @@
           <w:b w:val="0"/>
           <w:sz w:val="21"/>
         </w:rPr>
-        <w:t>[6] Tetlock P C. Giving content to investor sentiment: The role of media in the stock market[J]. The Journal of Finance, 2007, 62(3): 1139-1168.</w:t>
+        <w:t>[17] Zhang B, Yang H, Liu X Y. Instruct-FinGPT: Financial sentiment analysis by instruction tuning of general-purpose large language models[J]. arXiv preprint arXiv:2306.12659, 2023.</w:t>
       </w:r>
     </w:p>
     <w:p>
@@ -16101,7 +16088,7 @@
           <w:b w:val="0"/>
           <w:sz w:val="21"/>
         </w:rPr>
-        <w:t>[7] Loughran T, McDonald B. When is a liability not a liability? Textual analysis, dictionaries, and 10-Ks[J]. The Journal of Finance, 2011, 66(1): 35-65.</w:t>
+        <w:t>[18] Fatemi S, Hu Y. A comparative analysis of fine-tuned LLMs and few-shot learning of LLMs for financial sentiment analysis[J]. arXiv preprint arXiv:2312.08725, 2023.</w:t>
       </w:r>
     </w:p>
     <w:p>
@@ -16115,7 +16102,7 @@
           <w:b w:val="0"/>
           <w:sz w:val="21"/>
         </w:rPr>
-        <w:t>[8] Malo P, Sinha A, Korhonen P, et al. Good debt or bad debt: Detecting semantic orientations in economic texts[J]. Journal of the Association for Information Science and Technology, 2014, 65(4): 782-796.</w:t>
+        <w:t>[19] Paredes Amorin A, Python A, Weisser C. Fine-tuning of lightweight large language models for sentiment classification on heterogeneous financial textual data[J]. arXiv preprint arXiv:2512.00946, 2025.</w:t>
       </w:r>
     </w:p>
     <w:p>
@@ -16129,7 +16116,7 @@
           <w:b w:val="0"/>
           <w:sz w:val="21"/>
         </w:rPr>
-        <w:t>[9] Vaswani A, Shazeer N, Parmar N, et al. Attention is all you need[C]//Advances in Neural Information Processing Systems. 2017: 5998-6008.</w:t>
+        <w:t>[20] Guo C, Pleiss G, Sun Y, et al. On calibration of modern neural networks[C]//International Conference on Machine Learning. 2017: 1321-1330.</w:t>
       </w:r>
     </w:p>
     <w:p>
@@ -16143,7 +16130,7 @@
           <w:b w:val="0"/>
           <w:sz w:val="21"/>
         </w:rPr>
-        <w:t>[10] Devlin J, Chang M W, Lee K, et al. BERT: Pre-training of deep bidirectional transformers for language understanding[C]//Proceedings of NAACL-HLT. 2019: 4171-4186.</w:t>
+        <w:t>[21] Balabanov O, Linander H. Uncertainty quantification in fine-tuned LLMs using LoRA ensembles[J]. arXiv preprint arXiv:2402.12264, 2024.</w:t>
       </w:r>
     </w:p>
     <w:p>
@@ -16157,7 +16144,7 @@
           <w:b w:val="0"/>
           <w:sz w:val="21"/>
         </w:rPr>
-        <w:t>[11] Araci D. FinBERT: Financial sentiment analysis with pre-trained language models[J]. arXiv preprint arXiv:1908.10063, 2019.</w:t>
+        <w:t>[22] Lu D, Wu H, Liang J, et al. BBT-Fin: Comprehensive construction of Chinese financial domain pre-trained language model, corpus and benchmark[J]. arXiv preprint arXiv:2302.09432, 2023.</w:t>
       </w:r>
     </w:p>
     <w:p>
@@ -16171,7 +16158,7 @@
           <w:b w:val="0"/>
           <w:sz w:val="21"/>
         </w:rPr>
-        <w:t>[12] Cui Y, Che W, Liu T, et al. Pre-training with whole word masking for Chinese BERT[J]. IEEE/ACM Transactions on Audio, Speech, and Language Processing, 2021, 29: 3504-3514.</w:t>
+        <w:t>[23] Vaswani A, Shazeer N, Parmar N, et al. Attention is all you need[C]//Advances in Neural Information Processing Systems. 2017: 5998-6008.</w:t>
       </w:r>
     </w:p>
     <w:p>
@@ -16185,7 +16172,7 @@
           <w:b w:val="0"/>
           <w:sz w:val="21"/>
         </w:rPr>
-        <w:t>[13] Brown T, Mann B, Ryder N, et al. Language models are few-shot learners[C]//Advances in Neural Information Processing Systems. 2020: 1877-1901.</w:t>
+        <w:t>[24] Kaplan J, McCandlish S, Henighan T, et al. Scaling laws for neural language models[J]. arXiv preprint arXiv:2001.08361, 2020.</w:t>
       </w:r>
     </w:p>
     <w:p>
@@ -16199,7 +16186,7 @@
           <w:b w:val="0"/>
           <w:sz w:val="21"/>
         </w:rPr>
-        <w:t>[14] Kaplan J, McCandlish S, Henighan T, et al. Scaling laws for neural language models[J]. arXiv preprint arXiv:2001.08361, 2020.</w:t>
+        <w:t>[25] Dietterich T G. Approximate statistical tests for comparing supervised classification learning algorithms[J]. Neural Computation, 1998, 10(7): 1895-1923.</w:t>
       </w:r>
     </w:p>
     <w:p>
@@ -16213,7 +16200,7 @@
           <w:b w:val="0"/>
           <w:sz w:val="21"/>
         </w:rPr>
-        <w:t>[15] Yang A, Li A, Yang B, et al. Qwen3 technical report[J]. arXiv preprint arXiv:2505.09388, 2025.</w:t>
+        <w:t>[26] McNemar Q. Note on the sampling error of the difference between correlated proportions or percentages[J]. Psychometrika, 1947, 12(2): 153-157.</w:t>
       </w:r>
     </w:p>
     <w:p>
@@ -16227,7 +16214,7 @@
           <w:b w:val="0"/>
           <w:sz w:val="21"/>
         </w:rPr>
-        <w:t>[16] Wu S, Irsoy O, Lu S, et al. BloombergGPT: A large language model for finance[J]. arXiv preprint arXiv:2303.17564, 2023.</w:t>
+        <w:t>[27] Efron B, Tibshirani R J. An introduction to the bootstrap[M]. New York: Chapman &amp; Hall, 1993.</w:t>
       </w:r>
     </w:p>
     <w:p>
@@ -16241,7 +16228,7 @@
           <w:b w:val="0"/>
           <w:sz w:val="21"/>
         </w:rPr>
-        <w:t>[17] Yang H, Liu X Y, Wang C D. FinGPT: Open-source financial large language models[J]. arXiv preprint arXiv:2306.06031, 2023.</w:t>
+        <w:t>[28] Holm S. A simple sequentially rejective multiple test procedure[J]. Scandinavian Journal of Statistics, 1979, 6(2): 65-70.</w:t>
       </w:r>
     </w:p>
     <w:p>
@@ -16255,7 +16242,7 @@
           <w:b w:val="0"/>
           <w:sz w:val="21"/>
         </w:rPr>
-        <w:t>[18] Lu D, Wu H, Liang J, et al. BBT-Fin: Comprehensive construction of Chinese financial domain pre-trained language model, corpus and benchmark[J]. arXiv preprint arXiv:2302.09432, 2023.</w:t>
+        <w:t>[29] Chow C K. On optimum recognition error and reject tradeoff[J]. IEEE Transactions on Information Theory, 1970, 16(1): 41-46.</w:t>
       </w:r>
     </w:p>
     <w:p>
@@ -16269,7 +16256,7 @@
           <w:b w:val="0"/>
           <w:sz w:val="21"/>
         </w:rPr>
-        <w:t>[19] Hu E J, Shen Y, Wallis P, et al. LoRA: Low-rank adaptation of large language models[C]//International Conference on Learning Representations. 2022.</w:t>
+        <w:t>[30] Geifman Y, El-Yaniv R. Selective classification for deep neural networks[C]//Advances in Neural Information Processing Systems. 2017.</w:t>
       </w:r>
     </w:p>
     <w:p>
@@ -16283,231 +16270,7 @@
           <w:b w:val="0"/>
           <w:sz w:val="21"/>
         </w:rPr>
-        <w:t>[20] Dettmers T, Pagnoni A, Holtzman A, et al. QLoRA: Efficient finetuning of quantized LLMs[C]//Advances in Neural Information Processing Systems. 2023.</w:t>
-      </w:r>
-    </w:p>
-    <w:p>
-      <w:pPr>
-        <w:spacing w:line="360" w:lineRule="auto" w:after="0"/>
-        <w:ind w:left="420" w:hanging="420"/>
-      </w:pPr>
-      <w:r>
-        <w:rPr>
-          <w:rFonts w:ascii="Times New Roman" w:hAnsi="Times New Roman" w:eastAsia="宋体"/>
-          <w:b w:val="0"/>
-          <w:sz w:val="21"/>
-        </w:rPr>
-        <w:t>[21] Zheng Y, Zhang R, Zhang J, et al. LlamaFactory: Unified efficient fine-tuning of 100+ language models[C]//Proceedings of the 62nd Annual Meeting of the Association for Computational Linguistics (Volume 3: System Demonstrations). Bangkok: ACL, 2024: 400-410.</w:t>
-      </w:r>
-    </w:p>
-    <w:p>
-      <w:pPr>
-        <w:spacing w:line="360" w:lineRule="auto" w:after="0"/>
-        <w:ind w:left="420" w:hanging="420"/>
-      </w:pPr>
-      <w:r>
-        <w:rPr>
-          <w:rFonts w:ascii="Times New Roman" w:hAnsi="Times New Roman" w:eastAsia="宋体"/>
-          <w:b w:val="0"/>
-          <w:sz w:val="21"/>
-        </w:rPr>
-        <w:t>[22] Zhang B, Yang H, Liu X Y. Instruct-FinGPT: Financial sentiment analysis by instruction tuning of general-purpose large language models[J]. arXiv preprint arXiv:2306.12659, 2023.</w:t>
-      </w:r>
-    </w:p>
-    <w:p>
-      <w:pPr>
-        <w:spacing w:line="360" w:lineRule="auto" w:after="0"/>
-        <w:ind w:left="420" w:hanging="420"/>
-      </w:pPr>
-      <w:r>
-        <w:rPr>
-          <w:rFonts w:ascii="Times New Roman" w:hAnsi="Times New Roman" w:eastAsia="宋体"/>
-          <w:b w:val="0"/>
-          <w:sz w:val="21"/>
-        </w:rPr>
-        <w:t>[23] Zhang B, Yang H, Zhou T, et al. Enhancing financial sentiment analysis via retrieval augmented large language models[J]. arXiv preprint arXiv:2310.04027, 2023.</w:t>
-      </w:r>
-    </w:p>
-    <w:p>
-      <w:pPr>
-        <w:spacing w:line="360" w:lineRule="auto" w:after="0"/>
-        <w:ind w:left="420" w:hanging="420"/>
-      </w:pPr>
-      <w:r>
-        <w:rPr>
-          <w:rFonts w:ascii="Times New Roman" w:hAnsi="Times New Roman" w:eastAsia="宋体"/>
-          <w:b w:val="0"/>
-          <w:sz w:val="21"/>
-        </w:rPr>
-        <w:t>[24] Wang N, Yang H, Wang C D. FinGPT: Instruction tuning benchmark for open-source large language models in financial datasets[J]. arXiv preprint arXiv:2310.04793, 2023.</w:t>
-      </w:r>
-    </w:p>
-    <w:p>
-      <w:pPr>
-        <w:spacing w:line="360" w:lineRule="auto" w:after="0"/>
-        <w:ind w:left="420" w:hanging="420"/>
-      </w:pPr>
-      <w:r>
-        <w:rPr>
-          <w:rFonts w:ascii="Times New Roman" w:hAnsi="Times New Roman" w:eastAsia="宋体"/>
-          <w:b w:val="0"/>
-          <w:sz w:val="21"/>
-        </w:rPr>
-        <w:t>[25] Fatemi S, Hu Y. A comparative analysis of fine-tuned LLMs and few-shot learning of LLMs for financial sentiment analysis[J]. arXiv preprint arXiv:2312.08725, 2023.</w:t>
-      </w:r>
-    </w:p>
-    <w:p>
-      <w:pPr>
-        <w:spacing w:line="360" w:lineRule="auto" w:after="0"/>
-        <w:ind w:left="420" w:hanging="420"/>
-      </w:pPr>
-      <w:r>
-        <w:rPr>
-          <w:rFonts w:ascii="Times New Roman" w:hAnsi="Times New Roman" w:eastAsia="宋体"/>
-          <w:b w:val="0"/>
-          <w:sz w:val="21"/>
-        </w:rPr>
-        <w:t>[26] Paredes Amorin A, Python A, Weisser C. Fine-tuning of lightweight large language models for sentiment classification on heterogeneous financial textual data[J]. arXiv preprint arXiv:2512.00946, 2025.</w:t>
-      </w:r>
-    </w:p>
-    <w:p>
-      <w:pPr>
-        <w:spacing w:line="360" w:lineRule="auto" w:after="0"/>
-        <w:ind w:left="420" w:hanging="420"/>
-      </w:pPr>
-      <w:r>
-        <w:rPr>
-          <w:rFonts w:ascii="Times New Roman" w:hAnsi="Times New Roman" w:eastAsia="宋体"/>
-          <w:b w:val="0"/>
-          <w:sz w:val="21"/>
-        </w:rPr>
-        <w:t>[27] Cheng X. Financial sentiment analysis with large language models[J]. Finance &amp; Economics, 2025, 3(6). DOI: 10.61173/gvntfv56.</w:t>
-      </w:r>
-    </w:p>
-    <w:p>
-      <w:pPr>
-        <w:spacing w:line="360" w:lineRule="auto" w:after="0"/>
-        <w:ind w:left="420" w:hanging="420"/>
-      </w:pPr>
-      <w:r>
-        <w:rPr>
-          <w:rFonts w:ascii="Times New Roman" w:hAnsi="Times New Roman" w:eastAsia="宋体"/>
-          <w:b w:val="0"/>
-          <w:sz w:val="21"/>
-        </w:rPr>
-        <w:t>[28] Lan Y, Wu Y, Xu W, et al. Chinese fine-grained financial sentiment analysis with large language models[J]. arXiv preprint arXiv:2306.14096, 2023.</w:t>
-      </w:r>
-    </w:p>
-    <w:p>
-      <w:pPr>
-        <w:spacing w:line="360" w:lineRule="auto" w:after="0"/>
-        <w:ind w:left="420" w:hanging="420"/>
-      </w:pPr>
-      <w:r>
-        <w:rPr>
-          <w:rFonts w:ascii="Times New Roman" w:hAnsi="Times New Roman" w:eastAsia="宋体"/>
-          <w:b w:val="0"/>
-          <w:sz w:val="21"/>
-        </w:rPr>
-        <w:t>[29] McNemar Q. Note on the sampling error of the difference between correlated proportions or percentages[J]. Psychometrika, 1947, 12(2): 153-157.</w:t>
-      </w:r>
-    </w:p>
-    <w:p>
-      <w:pPr>
-        <w:spacing w:line="360" w:lineRule="auto" w:after="0"/>
-        <w:ind w:left="420" w:hanging="420"/>
-      </w:pPr>
-      <w:r>
-        <w:rPr>
-          <w:rFonts w:ascii="Times New Roman" w:hAnsi="Times New Roman" w:eastAsia="宋体"/>
-          <w:b w:val="0"/>
-          <w:sz w:val="21"/>
-        </w:rPr>
-        <w:t>[30] Dietterich T G. Approximate statistical tests for comparing supervised classification learning algorithms[J]. Neural Computation, 1998, 10(7): 1895-1923.</w:t>
-      </w:r>
-    </w:p>
-    <w:p>
-      <w:pPr>
-        <w:spacing w:line="360" w:lineRule="auto" w:after="0"/>
-        <w:ind w:left="420" w:hanging="420"/>
-      </w:pPr>
-      <w:r>
-        <w:rPr>
-          <w:rFonts w:ascii="Times New Roman" w:hAnsi="Times New Roman" w:eastAsia="宋体"/>
-          <w:b w:val="0"/>
-          <w:sz w:val="21"/>
-        </w:rPr>
-        <w:t>[31] Efron B, Tibshirani R J. An introduction to the bootstrap[M]. New York: Chapman &amp; Hall, 1993.</w:t>
-      </w:r>
-    </w:p>
-    <w:p>
-      <w:pPr>
-        <w:spacing w:line="360" w:lineRule="auto" w:after="0"/>
-        <w:ind w:left="420" w:hanging="420"/>
-      </w:pPr>
-      <w:r>
-        <w:rPr>
-          <w:rFonts w:ascii="Times New Roman" w:hAnsi="Times New Roman" w:eastAsia="宋体"/>
-          <w:b w:val="0"/>
-          <w:sz w:val="21"/>
-        </w:rPr>
-        <w:t>[32] Holm S. A simple sequentially rejective multiple test procedure[J]. Scandinavian Journal of Statistics, 1979, 6(2): 65-70.</w:t>
-      </w:r>
-    </w:p>
-    <w:p>
-      <w:pPr>
-        <w:spacing w:line="360" w:lineRule="auto" w:after="0"/>
-        <w:ind w:left="420" w:hanging="420"/>
-      </w:pPr>
-      <w:r>
-        <w:rPr>
-          <w:rFonts w:ascii="Times New Roman" w:hAnsi="Times New Roman" w:eastAsia="宋体"/>
-          <w:b w:val="0"/>
-          <w:sz w:val="21"/>
-        </w:rPr>
-        <w:t>[33] Guo C, Pleiss G, Sun Y, et al. On calibration of modern neural networks[C]//International Conference on Machine Learning. 2017: 1321-1330.</w:t>
-      </w:r>
-    </w:p>
-    <w:p>
-      <w:pPr>
-        <w:spacing w:line="360" w:lineRule="auto" w:after="0"/>
-        <w:ind w:left="420" w:hanging="420"/>
-      </w:pPr>
-      <w:r>
-        <w:rPr>
-          <w:rFonts w:ascii="Times New Roman" w:hAnsi="Times New Roman" w:eastAsia="宋体"/>
-          <w:b w:val="0"/>
-          <w:sz w:val="21"/>
-        </w:rPr>
-        <w:t>[34] Balabanov O, Linander H. Uncertainty quantification in fine-tuned LLMs using LoRA ensembles[J]. arXiv preprint arXiv:2402.12264, 2024.</w:t>
-      </w:r>
-    </w:p>
-    <w:p>
-      <w:pPr>
-        <w:spacing w:line="360" w:lineRule="auto" w:after="0"/>
-        <w:ind w:left="420" w:hanging="420"/>
-      </w:pPr>
-      <w:r>
-        <w:rPr>
-          <w:rFonts w:ascii="Times New Roman" w:hAnsi="Times New Roman" w:eastAsia="宋体"/>
-          <w:b w:val="0"/>
-          <w:sz w:val="21"/>
-        </w:rPr>
-        <w:t>[35] Chow C K. On optimum recognition error and reject tradeoff[J]. IEEE Transactions on Information Theory, 1970, 16(1): 41-46.</w:t>
-      </w:r>
-    </w:p>
-    <w:p>
-      <w:pPr>
-        <w:spacing w:line="360" w:lineRule="auto" w:after="0"/>
-        <w:ind w:left="420" w:hanging="420"/>
-      </w:pPr>
-      <w:r>
-        <w:rPr>
-          <w:rFonts w:ascii="Times New Roman" w:hAnsi="Times New Roman" w:eastAsia="宋体"/>
-          <w:b w:val="0"/>
-          <w:sz w:val="21"/>
-        </w:rPr>
-        <w:t>[36] Geifman Y, El-Yaniv R. Selective classification for deep neural networks[C]//Advances in Neural Information Processing Systems. 2017.</w:t>
+        <w:t>[31] Chen W, Wang Q, Long Z, et al. DISC-FinLLM: A Chinese financial large language model based on multiple experts fine-tuning[J]. arXiv preprint arXiv:2310.15205, 2023.</w:t>
       </w:r>
     </w:p>
     <w:sectPr>

</xml_diff>